<commit_message>
Update Plan prévisionnel mémoire de thèse V FO.docx
</commit_message>
<xml_diff>
--- a/Manuscript/preparatory/Plan prévisionnel mémoire de thèse V FO.docx
+++ b/Manuscript/preparatory/Plan prévisionnel mémoire de thèse V FO.docx
@@ -1,6 +1,6 @@
 
 <file path=word/document.xml><?xml version="1.0" encoding="utf-8"?>
-<w:document xmlns:wpc="http://schemas.microsoft.com/office/word/2010/wordprocessingCanvas" xmlns:cx="http://schemas.microsoft.com/office/drawing/2014/chartex" xmlns:cx1="http://schemas.microsoft.com/office/drawing/2015/9/8/chartex" xmlns:cx2="http://schemas.microsoft.com/office/drawing/2015/10/21/chartex" xmlns:cx3="http://schemas.microsoft.com/office/drawing/2016/5/9/chartex" xmlns:cx4="http://schemas.microsoft.com/office/drawing/2016/5/10/chartex" xmlns:cx5="http://schemas.microsoft.com/office/drawing/2016/5/11/chartex" xmlns:cx6="http://schemas.microsoft.com/office/drawing/2016/5/12/chartex" xmlns:cx7="http://schemas.microsoft.com/office/drawing/2016/5/13/chartex" xmlns:cx8="http://schemas.microsoft.com/office/drawing/2016/5/14/chartex" xmlns:mc="http://schemas.openxmlformats.org/markup-compatibility/2006" xmlns:aink="http://schemas.microsoft.com/office/drawing/2016/ink" xmlns:am3d="http://schemas.microsoft.com/office/drawing/2017/model3d" xmlns:o="urn:schemas-microsoft-com:office:office" xmlns:r="http://schemas.openxmlformats.org/officeDocument/2006/relationships" xmlns:m="http://schemas.openxmlformats.org/officeDocument/2006/math" xmlns:v="urn:schemas-microsoft-com:vml" xmlns:wp14="http://schemas.microsoft.com/office/word/2010/wordprocessingDrawing" xmlns:wp="http://schemas.openxmlformats.org/drawingml/2006/wordprocessingDrawing" xmlns:w10="urn:schemas-microsoft-com:office:word" xmlns:w="http://schemas.openxmlformats.org/wordprocessingml/2006/main" xmlns:w14="http://schemas.microsoft.com/office/word/2010/wordml" xmlns:w15="http://schemas.microsoft.com/office/word/2012/wordml" xmlns:w16cid="http://schemas.microsoft.com/office/word/2016/wordml/cid" xmlns:w16se="http://schemas.microsoft.com/office/word/2015/wordml/symex" xmlns:wpg="http://schemas.microsoft.com/office/word/2010/wordprocessingGroup" xmlns:wpi="http://schemas.microsoft.com/office/word/2010/wordprocessingInk" xmlns:wne="http://schemas.microsoft.com/office/word/2006/wordml" xmlns:wps="http://schemas.microsoft.com/office/word/2010/wordprocessingShape" mc:Ignorable="w14 w15 w16se w16cid wp14">
+<w:document xmlns:wpc="http://schemas.microsoft.com/office/word/2010/wordprocessingCanvas" xmlns:cx="http://schemas.microsoft.com/office/drawing/2014/chartex" xmlns:cx1="http://schemas.microsoft.com/office/drawing/2015/9/8/chartex" xmlns:mc="http://schemas.openxmlformats.org/markup-compatibility/2006" xmlns:o="urn:schemas-microsoft-com:office:office" xmlns:r="http://schemas.openxmlformats.org/officeDocument/2006/relationships" xmlns:m="http://schemas.openxmlformats.org/officeDocument/2006/math" xmlns:v="urn:schemas-microsoft-com:vml" xmlns:wp14="http://schemas.microsoft.com/office/word/2010/wordprocessingDrawing" xmlns:wp="http://schemas.openxmlformats.org/drawingml/2006/wordprocessingDrawing" xmlns:w10="urn:schemas-microsoft-com:office:word" xmlns:w="http://schemas.openxmlformats.org/wordprocessingml/2006/main" xmlns:w14="http://schemas.microsoft.com/office/word/2010/wordml" xmlns:w15="http://schemas.microsoft.com/office/word/2012/wordml" xmlns:w16se="http://schemas.microsoft.com/office/word/2015/wordml/symex" xmlns:wpg="http://schemas.microsoft.com/office/word/2010/wordprocessingGroup" xmlns:wpi="http://schemas.microsoft.com/office/word/2010/wordprocessingInk" xmlns:wne="http://schemas.microsoft.com/office/word/2006/wordml" xmlns:wps="http://schemas.microsoft.com/office/word/2010/wordprocessingShape" mc:Ignorable="w14 w15 w16se wp14">
   <w:body>
     <w:p>
       <w:pPr>
@@ -87,50 +87,10 @@
         <w:pStyle w:val="Titre2"/>
       </w:pPr>
       <w:r>
-        <w:t>Robotique collaborative</w:t>
-      </w:r>
-    </w:p>
-    <w:p>
-      <w:pPr>
-        <w:pStyle w:val="Titre3"/>
-      </w:pPr>
-      <w:r>
-        <w:t>Historique</w:t>
-      </w:r>
-    </w:p>
-    <w:p>
-      <w:pPr>
-        <w:pStyle w:val="Titre4"/>
-      </w:pPr>
-      <w:r>
-        <w:t>General</w:t>
-      </w:r>
-    </w:p>
-    <w:p>
-      <w:pPr>
-        <w:pStyle w:val="Titre4"/>
-      </w:pPr>
-      <w:r>
-        <w:t>Robotique collaborative</w:t>
-      </w:r>
-    </w:p>
-    <w:p>
-      <w:pPr>
-        <w:pStyle w:val="Titre3"/>
-      </w:pPr>
-      <w:r>
-        <w:t>Types de collaboration</w:t>
-      </w:r>
-      <w:r>
-        <w:t xml:space="preserve"> </w:t>
-      </w:r>
-    </w:p>
-    <w:p>
-      <w:pPr>
-        <w:pStyle w:val="Titre4"/>
-      </w:pPr>
-      <w:r>
-        <w:t>General</w:t>
+        <w:t>Vers une r</w:t>
+      </w:r>
+      <w:r>
+        <w:t>obotique collaborative</w:t>
       </w:r>
     </w:p>
     <w:p>
@@ -142,7 +102,50 @@
         </w:numPr>
       </w:pPr>
       <w:r>
-        <w:t>Parole</w:t>
+        <w:t>Paragraphe introductif</w:t>
+      </w:r>
+      <w:r>
+        <w:t xml:space="preserve"> (1 </w:t>
+      </w:r>
+      <w:r>
+        <w:rPr>
+          <w:bCs/>
+        </w:rPr>
+        <w:t>§</w:t>
+      </w:r>
+      <w:r>
+        <w:rPr>
+          <w:bCs/>
+        </w:rPr>
+        <w:t xml:space="preserve"> -&gt; focus sur les bras robotisés</w:t>
+      </w:r>
+      <w:r>
+        <w:rPr>
+          <w:bCs/>
+        </w:rPr>
+        <w:t>)</w:t>
+      </w:r>
+    </w:p>
+    <w:p>
+      <w:pPr>
+        <w:pStyle w:val="Titre3"/>
+      </w:pPr>
+      <w:r>
+        <w:t>L’</w:t>
+      </w:r>
+      <w:r>
+        <w:t>émergence de la roboti</w:t>
+      </w:r>
+      <w:r>
+        <w:t>que collaborative et ses enjeux</w:t>
+      </w:r>
+    </w:p>
+    <w:p>
+      <w:pPr>
+        <w:pStyle w:val="Titre4"/>
+      </w:pPr>
+      <w:r>
+        <w:t>Genèse de la robotique</w:t>
       </w:r>
     </w:p>
     <w:p>
@@ -154,7 +157,19 @@
         </w:numPr>
       </w:pPr>
       <w:r>
-        <w:t>Compréhension d’intentions</w:t>
+        <w:t xml:space="preserve">Origine du mot (1 </w:t>
+      </w:r>
+      <w:r>
+        <w:rPr>
+          <w:bCs/>
+        </w:rPr>
+        <w:t>§</w:t>
+      </w:r>
+      <w:r>
+        <w:rPr>
+          <w:bCs/>
+        </w:rPr>
+        <w:t>)</w:t>
       </w:r>
     </w:p>
     <w:p>
@@ -166,15 +181,19 @@
         </w:numPr>
       </w:pPr>
       <w:r>
-        <w:t>Physique…</w:t>
-      </w:r>
-    </w:p>
-    <w:p>
-      <w:pPr>
-        <w:pStyle w:val="Titre4"/>
-      </w:pPr>
-      <w:r>
-        <w:t>Robotique collaborative</w:t>
+        <w:t>Définition d’un robot (</w:t>
+      </w:r>
+      <w:r>
+        <w:t>1</w:t>
+      </w:r>
+      <w:r>
+        <w:t xml:space="preserve"> </w:t>
+      </w:r>
+      <w:r>
+        <w:rPr>
+          <w:bCs/>
+        </w:rPr>
+        <w:t>§)</w:t>
       </w:r>
     </w:p>
     <w:p>
@@ -186,7 +205,42 @@
         </w:numPr>
       </w:pPr>
       <w:r>
-        <w:t>Partage de zone de travail (intermittent)</w:t>
+        <w:rPr>
+          <w:bCs/>
+        </w:rPr>
+        <w:t xml:space="preserve">Avènement de la robotique industrielle et ses limites (1 </w:t>
+      </w:r>
+      <w:r>
+        <w:rPr>
+          <w:bCs/>
+        </w:rPr>
+        <w:t>–</w:t>
+      </w:r>
+      <w:r>
+        <w:rPr>
+          <w:bCs/>
+        </w:rPr>
+        <w:t xml:space="preserve"> 3</w:t>
+      </w:r>
+      <w:r>
+        <w:rPr>
+          <w:bCs/>
+        </w:rPr>
+        <w:t xml:space="preserve"> </w:t>
+      </w:r>
+      <w:r>
+        <w:rPr>
+          <w:bCs/>
+        </w:rPr>
+        <w:t>§)</w:t>
+      </w:r>
+    </w:p>
+    <w:p>
+      <w:pPr>
+        <w:pStyle w:val="Titre4"/>
+      </w:pPr>
+      <w:r>
+        <w:t>Vers une collaboration Homme-Robot</w:t>
       </w:r>
     </w:p>
     <w:p>
@@ -198,7 +252,16 @@
         </w:numPr>
       </w:pPr>
       <w:r>
-        <w:t>Contacts indirects</w:t>
+        <w:rPr>
+          <w:bCs/>
+        </w:rPr>
+        <w:t xml:space="preserve">Définition d’un robot collaboratif (1 </w:t>
+      </w:r>
+      <w:r>
+        <w:rPr>
+          <w:bCs/>
+        </w:rPr>
+        <w:t>§)</w:t>
       </w:r>
     </w:p>
     <w:p>
@@ -210,23 +273,19 @@
         </w:numPr>
       </w:pPr>
       <w:r>
-        <w:t xml:space="preserve">Contacts directs (démonstration </w:t>
-      </w:r>
-      <w:proofErr w:type="spellStart"/>
-      <w:r>
-        <w:t>learning</w:t>
-      </w:r>
-      <w:proofErr w:type="spellEnd"/>
-      <w:r>
-        <w:t>)</w:t>
-      </w:r>
-    </w:p>
-    <w:p>
-      <w:pPr>
-        <w:pStyle w:val="Titre3"/>
-      </w:pPr>
-      <w:r>
-        <w:t>Contrôle robotique lors d’interactions physiques</w:t>
+        <w:t xml:space="preserve">Problématiques à laquelle répond la robotique coll. </w:t>
+      </w:r>
+      <w:r>
+        <w:rPr>
+          <w:bCs/>
+        </w:rPr>
+        <w:t xml:space="preserve">(1 </w:t>
+      </w:r>
+      <w:r>
+        <w:rPr>
+          <w:bCs/>
+        </w:rPr>
+        <w:t>§)</w:t>
       </w:r>
     </w:p>
     <w:p>
@@ -238,7 +297,68 @@
         </w:numPr>
       </w:pPr>
       <w:r>
-        <w:t>Rester assez général ? se référer à la partie II - A</w:t>
+        <w:t>Exemple</w:t>
+      </w:r>
+      <w:r>
+        <w:t>s</w:t>
+      </w:r>
+      <w:r>
+        <w:t xml:space="preserve"> applicatif</w:t>
+      </w:r>
+      <w:r>
+        <w:t>s</w:t>
+      </w:r>
+      <w:r>
+        <w:t xml:space="preserve"> de robots collaboratifs </w:t>
+      </w:r>
+      <w:r>
+        <w:t xml:space="preserve">(industriels ?) </w:t>
+      </w:r>
+      <w:r>
+        <w:rPr>
+          <w:bCs/>
+        </w:rPr>
+        <w:t>(1</w:t>
+      </w:r>
+      <w:r>
+        <w:rPr>
+          <w:bCs/>
+        </w:rPr>
+        <w:t xml:space="preserve"> – 2 </w:t>
+      </w:r>
+      <w:r>
+        <w:rPr>
+          <w:bCs/>
+        </w:rPr>
+        <w:t>§)</w:t>
+      </w:r>
+    </w:p>
+    <w:p>
+      <w:pPr>
+        <w:pStyle w:val="Titre3"/>
+        <w:rPr>
+          <w:highlight w:val="yellow"/>
+        </w:rPr>
+      </w:pPr>
+      <w:r>
+        <w:rPr>
+          <w:highlight w:val="yellow"/>
+        </w:rPr>
+        <w:t xml:space="preserve">Types de collaboration </w:t>
+      </w:r>
+      <w:r>
+        <w:rPr>
+          <w:highlight w:val="yellow"/>
+        </w:rPr>
+        <w:t>(???)</w:t>
+      </w:r>
+    </w:p>
+    <w:p>
+      <w:pPr>
+        <w:pStyle w:val="Titre4"/>
+      </w:pPr>
+      <w:r>
+        <w:t>Environnements collaboratifs</w:t>
       </w:r>
     </w:p>
     <w:p>
@@ -250,6 +370,638 @@
         </w:numPr>
       </w:pPr>
       <w:r>
+        <w:t>Contextes propices à la collaboration (industriel, médical, secours, …) (</w:t>
+      </w:r>
+      <w:r>
+        <w:rPr>
+          <w:bCs/>
+        </w:rPr>
+        <w:t xml:space="preserve">1 – 2 </w:t>
+      </w:r>
+      <w:r>
+        <w:rPr>
+          <w:bCs/>
+        </w:rPr>
+        <w:t>§)</w:t>
+      </w:r>
+    </w:p>
+    <w:p>
+      <w:pPr>
+        <w:pStyle w:val="Paragraphedeliste"/>
+        <w:numPr>
+          <w:ilvl w:val="0"/>
+          <w:numId w:val="27"/>
+        </w:numPr>
+      </w:pPr>
+      <w:r>
+        <w:t>Partage de zone de travail</w:t>
+      </w:r>
+      <w:r>
+        <w:t xml:space="preserve"> (industriel)</w:t>
+      </w:r>
+      <w:r>
+        <w:t xml:space="preserve"> </w:t>
+      </w:r>
+      <w:r>
+        <w:t>(</w:t>
+      </w:r>
+      <w:r>
+        <w:rPr>
+          <w:bCs/>
+        </w:rPr>
+        <w:t>1</w:t>
+      </w:r>
+      <w:r>
+        <w:rPr>
+          <w:bCs/>
+        </w:rPr>
+        <w:t xml:space="preserve"> – 2 </w:t>
+      </w:r>
+      <w:r>
+        <w:rPr>
+          <w:bCs/>
+        </w:rPr>
+        <w:t>§)</w:t>
+      </w:r>
+    </w:p>
+    <w:p>
+      <w:pPr>
+        <w:pStyle w:val="Paragraphedeliste"/>
+        <w:numPr>
+          <w:ilvl w:val="0"/>
+          <w:numId w:val="27"/>
+        </w:numPr>
+      </w:pPr>
+      <w:r>
+        <w:t>Corps humain (exosquelettes, orthèses et prothèses)</w:t>
+      </w:r>
+      <w:r>
+        <w:t xml:space="preserve"> </w:t>
+      </w:r>
+      <w:r>
+        <w:t>(</w:t>
+      </w:r>
+      <w:r>
+        <w:rPr>
+          <w:bCs/>
+        </w:rPr>
+        <w:t xml:space="preserve">1 – 2 </w:t>
+      </w:r>
+      <w:r>
+        <w:rPr>
+          <w:bCs/>
+        </w:rPr>
+        <w:t>§)</w:t>
+      </w:r>
+    </w:p>
+    <w:p>
+      <w:pPr>
+        <w:pStyle w:val="Titre4"/>
+      </w:pPr>
+      <w:r>
+        <w:t>Modalités de communications</w:t>
+      </w:r>
+    </w:p>
+    <w:p>
+      <w:pPr>
+        <w:pStyle w:val="Paragraphedeliste"/>
+        <w:numPr>
+          <w:ilvl w:val="0"/>
+          <w:numId w:val="28"/>
+        </w:numPr>
+      </w:pPr>
+      <w:r>
+        <w:t>Sonore (verbal, auditif)</w:t>
+      </w:r>
+      <w:r>
+        <w:t xml:space="preserve"> </w:t>
+      </w:r>
+      <w:r>
+        <w:t>(</w:t>
+      </w:r>
+      <w:r>
+        <w:rPr>
+          <w:bCs/>
+        </w:rPr>
+        <w:t xml:space="preserve">1 – 2 </w:t>
+      </w:r>
+      <w:r>
+        <w:rPr>
+          <w:bCs/>
+        </w:rPr>
+        <w:t>§)</w:t>
+      </w:r>
+    </w:p>
+    <w:p>
+      <w:pPr>
+        <w:pStyle w:val="Paragraphedeliste"/>
+        <w:numPr>
+          <w:ilvl w:val="1"/>
+          <w:numId w:val="28"/>
+        </w:numPr>
+      </w:pPr>
+      <w:r>
+        <w:rPr>
+          <w:bCs/>
+        </w:rPr>
+        <w:t xml:space="preserve">Caractéristiques de cette modalité (temps de réponse, débit d’informations, </w:t>
+      </w:r>
+      <w:r>
+        <w:rPr>
+          <w:bCs/>
+        </w:rPr>
+        <w:t>…)</w:t>
+      </w:r>
+    </w:p>
+    <w:p>
+      <w:pPr>
+        <w:pStyle w:val="Paragraphedeliste"/>
+        <w:numPr>
+          <w:ilvl w:val="1"/>
+          <w:numId w:val="28"/>
+        </w:numPr>
+      </w:pPr>
+      <w:r>
+        <w:rPr>
+          <w:bCs/>
+        </w:rPr>
+        <w:t>Avantages et limites</w:t>
+      </w:r>
+    </w:p>
+    <w:p>
+      <w:pPr>
+        <w:pStyle w:val="Paragraphedeliste"/>
+        <w:numPr>
+          <w:ilvl w:val="1"/>
+          <w:numId w:val="28"/>
+        </w:numPr>
+      </w:pPr>
+      <w:r>
+        <w:rPr>
+          <w:bCs/>
+        </w:rPr>
+        <w:t>Exemples d’applications</w:t>
+      </w:r>
+    </w:p>
+    <w:p>
+      <w:pPr>
+        <w:pStyle w:val="Paragraphedeliste"/>
+        <w:numPr>
+          <w:ilvl w:val="0"/>
+          <w:numId w:val="28"/>
+        </w:numPr>
+      </w:pPr>
+      <w:r>
+        <w:t>Visuel (mouvements, détection d’intentions…)</w:t>
+      </w:r>
+      <w:r>
+        <w:t xml:space="preserve"> </w:t>
+      </w:r>
+      <w:r>
+        <w:t>(</w:t>
+      </w:r>
+      <w:r>
+        <w:rPr>
+          <w:bCs/>
+        </w:rPr>
+        <w:t xml:space="preserve">1 – 2 </w:t>
+      </w:r>
+      <w:r>
+        <w:rPr>
+          <w:bCs/>
+        </w:rPr>
+        <w:t>§)</w:t>
+      </w:r>
+    </w:p>
+    <w:p>
+      <w:pPr>
+        <w:pStyle w:val="Paragraphedeliste"/>
+        <w:numPr>
+          <w:ilvl w:val="0"/>
+          <w:numId w:val="28"/>
+        </w:numPr>
+      </w:pPr>
+      <w:proofErr w:type="spellStart"/>
+      <w:r>
+        <w:t>Haptique</w:t>
+      </w:r>
+      <w:proofErr w:type="spellEnd"/>
+      <w:r>
+        <w:t>, kinesthésique</w:t>
+      </w:r>
+      <w:r>
+        <w:t xml:space="preserve"> </w:t>
+      </w:r>
+      <w:r>
+        <w:t>(</w:t>
+      </w:r>
+      <w:r>
+        <w:rPr>
+          <w:bCs/>
+        </w:rPr>
+        <w:t>1</w:t>
+      </w:r>
+      <w:r>
+        <w:rPr>
+          <w:bCs/>
+        </w:rPr>
+        <w:t xml:space="preserve"> – </w:t>
+      </w:r>
+      <w:r>
+        <w:rPr>
+          <w:bCs/>
+        </w:rPr>
+        <w:t>2</w:t>
+      </w:r>
+      <w:r>
+        <w:rPr>
+          <w:bCs/>
+        </w:rPr>
+        <w:t xml:space="preserve"> </w:t>
+      </w:r>
+      <w:r>
+        <w:rPr>
+          <w:bCs/>
+        </w:rPr>
+        <w:t>§)</w:t>
+      </w:r>
+      <w:r>
+        <w:t xml:space="preserve"> </w:t>
+      </w:r>
+    </w:p>
+    <w:p>
+      <w:pPr>
+        <w:pStyle w:val="Paragraphedeliste"/>
+        <w:numPr>
+          <w:ilvl w:val="0"/>
+          <w:numId w:val="28"/>
+        </w:numPr>
+      </w:pPr>
+      <w:r>
+        <w:rPr>
+          <w:highlight w:val="red"/>
+        </w:rPr>
+        <w:t>Interface visuelle (visage digital, …)</w:t>
+      </w:r>
+      <w:r>
+        <w:rPr>
+          <w:highlight w:val="red"/>
+        </w:rPr>
+        <w:t xml:space="preserve"> </w:t>
+      </w:r>
+      <w:r>
+        <w:rPr>
+          <w:highlight w:val="red"/>
+        </w:rPr>
+        <w:t>(</w:t>
+      </w:r>
+      <w:r>
+        <w:rPr>
+          <w:bCs/>
+          <w:highlight w:val="red"/>
+        </w:rPr>
+        <w:t>1 – 2 §)</w:t>
+      </w:r>
+      <w:r>
+        <w:rPr>
+          <w:bCs/>
+          <w:highlight w:val="red"/>
+        </w:rPr>
+        <w:t> ??</w:t>
+      </w:r>
+    </w:p>
+    <w:p>
+      <w:pPr>
+        <w:pStyle w:val="Paragraphedeliste"/>
+        <w:numPr>
+          <w:ilvl w:val="0"/>
+          <w:numId w:val="28"/>
+        </w:numPr>
+      </w:pPr>
+      <w:r>
+        <w:t>Collaboration humain / humain</w:t>
+      </w:r>
+      <w:r>
+        <w:t xml:space="preserve"> </w:t>
+      </w:r>
+      <w:r>
+        <w:t>(</w:t>
+      </w:r>
+      <w:r>
+        <w:rPr>
+          <w:bCs/>
+        </w:rPr>
+        <w:t xml:space="preserve">1 – 2 </w:t>
+      </w:r>
+      <w:r>
+        <w:rPr>
+          <w:bCs/>
+        </w:rPr>
+        <w:t>§)</w:t>
+      </w:r>
+    </w:p>
+    <w:p>
+      <w:pPr>
+        <w:pStyle w:val="Paragraphedeliste"/>
+        <w:numPr>
+          <w:ilvl w:val="1"/>
+          <w:numId w:val="28"/>
+        </w:numPr>
+      </w:pPr>
+      <w:r>
+        <w:rPr>
+          <w:bCs/>
+        </w:rPr>
+        <w:t>Intérêts de l’étude des interactions entre les humains</w:t>
+      </w:r>
+    </w:p>
+    <w:p>
+      <w:pPr>
+        <w:pStyle w:val="Paragraphedeliste"/>
+        <w:numPr>
+          <w:ilvl w:val="1"/>
+          <w:numId w:val="28"/>
+        </w:numPr>
+        <w:rPr>
+          <w:highlight w:val="yellow"/>
+        </w:rPr>
+      </w:pPr>
+      <w:r>
+        <w:rPr>
+          <w:bCs/>
+          <w:highlight w:val="yellow"/>
+        </w:rPr>
+        <w:t>Recherche bibliographique à faire</w:t>
+      </w:r>
+      <w:r>
+        <w:rPr>
+          <w:bCs/>
+          <w:highlight w:val="yellow"/>
+        </w:rPr>
+        <w:t xml:space="preserve"> [</w:t>
+      </w:r>
+      <w:proofErr w:type="spellStart"/>
+      <w:r>
+        <w:rPr>
+          <w:bCs/>
+          <w:highlight w:val="yellow"/>
+        </w:rPr>
+        <w:t>Ganesh</w:t>
+      </w:r>
+      <w:proofErr w:type="spellEnd"/>
+      <w:r>
+        <w:rPr>
+          <w:bCs/>
+          <w:highlight w:val="yellow"/>
+        </w:rPr>
+        <w:t xml:space="preserve"> et al. 2014]</w:t>
+      </w:r>
+    </w:p>
+    <w:p>
+      <w:pPr>
+        <w:pStyle w:val="Paragraphedeliste"/>
+        <w:numPr>
+          <w:ilvl w:val="1"/>
+          <w:numId w:val="28"/>
+        </w:numPr>
+        <w:rPr>
+          <w:highlight w:val="yellow"/>
+        </w:rPr>
+      </w:pPr>
+      <w:r>
+        <w:rPr>
+          <w:bCs/>
+          <w:highlight w:val="yellow"/>
+        </w:rPr>
+        <w:t>Exemples d’exploitation ?</w:t>
+      </w:r>
+    </w:p>
+    <w:p>
+      <w:pPr>
+        <w:pStyle w:val="Titre4"/>
+      </w:pPr>
+      <w:r>
+        <w:t xml:space="preserve">Interactions </w:t>
+      </w:r>
+      <w:proofErr w:type="spellStart"/>
+      <w:r>
+        <w:t>haptiques</w:t>
+      </w:r>
+      <w:proofErr w:type="spellEnd"/>
+    </w:p>
+    <w:p>
+      <w:pPr>
+        <w:pStyle w:val="Paragraphedeliste"/>
+        <w:numPr>
+          <w:ilvl w:val="0"/>
+          <w:numId w:val="27"/>
+        </w:numPr>
+      </w:pPr>
+      <w:r>
+        <w:t xml:space="preserve">Types d’interactions </w:t>
+      </w:r>
+      <w:proofErr w:type="spellStart"/>
+      <w:r>
+        <w:t>haptique</w:t>
+      </w:r>
+      <w:proofErr w:type="spellEnd"/>
+      <w:r>
+        <w:t xml:space="preserve"> (retour de force, transmission d’émotions [cf. projet 1A], simulation du sens du toucher, amplification d’efforts [X. Lamy], contraintes géométriques [S. </w:t>
+      </w:r>
+      <w:proofErr w:type="spellStart"/>
+      <w:r>
+        <w:t>Restrepo</w:t>
+      </w:r>
+      <w:proofErr w:type="spellEnd"/>
+      <w:r>
+        <w:t>], …)</w:t>
+      </w:r>
+      <w:r>
+        <w:t xml:space="preserve"> </w:t>
+      </w:r>
+      <w:r>
+        <w:rPr>
+          <w:bCs/>
+        </w:rPr>
+        <w:t>(</w:t>
+      </w:r>
+      <w:r>
+        <w:rPr>
+          <w:bCs/>
+        </w:rPr>
+        <w:t>?</w:t>
+      </w:r>
+      <w:r>
+        <w:rPr>
+          <w:bCs/>
+        </w:rPr>
+        <w:t xml:space="preserve"> §)</w:t>
+      </w:r>
+      <w:r>
+        <w:t xml:space="preserve"> </w:t>
+      </w:r>
+    </w:p>
+    <w:p>
+      <w:pPr>
+        <w:pStyle w:val="Paragraphedeliste"/>
+        <w:numPr>
+          <w:ilvl w:val="0"/>
+          <w:numId w:val="27"/>
+        </w:numPr>
+      </w:pPr>
+      <w:r>
+        <w:t xml:space="preserve">Contacts indirects (assistance au port de charge) </w:t>
+      </w:r>
+      <w:r>
+        <w:rPr>
+          <w:bCs/>
+        </w:rPr>
+        <w:t xml:space="preserve">(2 – 3 </w:t>
+      </w:r>
+      <w:r>
+        <w:rPr>
+          <w:bCs/>
+        </w:rPr>
+        <w:t>§)</w:t>
+      </w:r>
+    </w:p>
+    <w:p>
+      <w:pPr>
+        <w:pStyle w:val="Paragraphedeliste"/>
+        <w:numPr>
+          <w:ilvl w:val="0"/>
+          <w:numId w:val="27"/>
+        </w:numPr>
+      </w:pPr>
+      <w:r>
+        <w:t>Contacts directs (</w:t>
+      </w:r>
+      <w:r>
+        <w:t xml:space="preserve">contact avec l’effecteur final, contact avec l’ensemble du robot, </w:t>
+      </w:r>
+      <w:r>
+        <w:t xml:space="preserve">démonstration </w:t>
+      </w:r>
+      <w:proofErr w:type="spellStart"/>
+      <w:r>
+        <w:t>learning</w:t>
+      </w:r>
+      <w:proofErr w:type="spellEnd"/>
+      <w:r>
+        <w:t>)</w:t>
+      </w:r>
+      <w:r>
+        <w:t xml:space="preserve"> </w:t>
+      </w:r>
+      <w:r>
+        <w:rPr>
+          <w:bCs/>
+        </w:rPr>
+        <w:t>(</w:t>
+      </w:r>
+      <w:r>
+        <w:rPr>
+          <w:bCs/>
+        </w:rPr>
+        <w:t>3</w:t>
+      </w:r>
+      <w:r>
+        <w:rPr>
+          <w:bCs/>
+        </w:rPr>
+        <w:t xml:space="preserve"> – </w:t>
+      </w:r>
+      <w:r>
+        <w:rPr>
+          <w:bCs/>
+        </w:rPr>
+        <w:t>4</w:t>
+      </w:r>
+      <w:r>
+        <w:rPr>
+          <w:bCs/>
+        </w:rPr>
+        <w:t xml:space="preserve"> </w:t>
+      </w:r>
+      <w:r>
+        <w:rPr>
+          <w:bCs/>
+        </w:rPr>
+        <w:t>§)</w:t>
+      </w:r>
+    </w:p>
+    <w:p>
+      <w:pPr>
+        <w:pStyle w:val="Titre3"/>
+      </w:pPr>
+      <w:r>
+        <w:t>Contrôle robotique lors d’interactions physiques</w:t>
+      </w:r>
+    </w:p>
+    <w:p>
+      <w:pPr>
+        <w:pStyle w:val="Paragraphedeliste"/>
+        <w:numPr>
+          <w:ilvl w:val="0"/>
+          <w:numId w:val="27"/>
+        </w:numPr>
+        <w:rPr>
+          <w:highlight w:val="yellow"/>
+        </w:rPr>
+      </w:pPr>
+      <w:r>
+        <w:rPr>
+          <w:highlight w:val="yellow"/>
+        </w:rPr>
+        <w:t xml:space="preserve">Rester assez général ? se référer à la partie II </w:t>
+      </w:r>
+      <w:r>
+        <w:rPr>
+          <w:highlight w:val="yellow"/>
+        </w:rPr>
+        <w:t>–</w:t>
+      </w:r>
+      <w:r>
+        <w:rPr>
+          <w:highlight w:val="yellow"/>
+        </w:rPr>
+        <w:t xml:space="preserve"> A</w:t>
+      </w:r>
+    </w:p>
+    <w:p>
+      <w:pPr>
+        <w:pStyle w:val="Paragraphedeliste"/>
+        <w:numPr>
+          <w:ilvl w:val="0"/>
+          <w:numId w:val="27"/>
+        </w:numPr>
+        <w:rPr>
+          <w:highlight w:val="yellow"/>
+        </w:rPr>
+      </w:pPr>
+      <w:r>
+        <w:rPr>
+          <w:highlight w:val="yellow"/>
+        </w:rPr>
+        <w:lastRenderedPageBreak/>
+        <w:t xml:space="preserve">Schéma bloc généraliste, pour montrer comment l’humain intervient (supervision, …), sur quoi agit le robot, </w:t>
+      </w:r>
+    </w:p>
+    <w:p>
+      <w:pPr>
+        <w:pStyle w:val="Paragraphedeliste"/>
+        <w:numPr>
+          <w:ilvl w:val="0"/>
+          <w:numId w:val="27"/>
+        </w:numPr>
+        <w:rPr>
+          <w:highlight w:val="yellow"/>
+        </w:rPr>
+      </w:pPr>
+      <w:r>
+        <w:rPr>
+          <w:highlight w:val="yellow"/>
+        </w:rPr>
         <w:t>Importance de comprendre modéliser le comportement humain</w:t>
       </w:r>
     </w:p>
@@ -260,9 +1012,21 @@
           <w:ilvl w:val="1"/>
           <w:numId w:val="27"/>
         </w:numPr>
-      </w:pPr>
-      <w:r>
+        <w:rPr>
+          <w:highlight w:val="yellow"/>
+        </w:rPr>
+      </w:pPr>
+      <w:r>
+        <w:rPr>
+          <w:highlight w:val="yellow"/>
+        </w:rPr>
         <w:t>Reproduire ses performances</w:t>
+      </w:r>
+      <w:r>
+        <w:rPr>
+          <w:highlight w:val="yellow"/>
+        </w:rPr>
+        <w:t xml:space="preserve"> (s’inspirer du modèle humain vers une autonomie du robot)</w:t>
       </w:r>
     </w:p>
     <w:p>
@@ -272,8 +1036,14 @@
           <w:ilvl w:val="1"/>
           <w:numId w:val="27"/>
         </w:numPr>
-      </w:pPr>
-      <w:r>
+        <w:rPr>
+          <w:highlight w:val="yellow"/>
+        </w:rPr>
+      </w:pPr>
+      <w:r>
+        <w:rPr>
+          <w:highlight w:val="yellow"/>
+        </w:rPr>
         <w:t>Améliorer les interactions avec l’humain</w:t>
       </w:r>
     </w:p>
@@ -284,24 +1054,8 @@
       <w:r>
         <w:t>Modélisation du comportement humain</w:t>
       </w:r>
-    </w:p>
-    <w:p>
-      <w:pPr>
-        <w:pStyle w:val="Titre3"/>
-      </w:pPr>
-      <w:r>
-        <w:t>Historique</w:t>
-      </w:r>
-    </w:p>
-    <w:p>
-      <w:pPr>
-        <w:pStyle w:val="Titre4"/>
-      </w:pPr>
-      <w:r>
-        <w:t>General (sur l’humain)</w:t>
-      </w:r>
-      <w:r>
-        <w:t xml:space="preserve"> </w:t>
+      <w:r>
+        <w:t xml:space="preserve"> / « L’apport » des sciences du mouvement </w:t>
       </w:r>
     </w:p>
     <w:p>
@@ -313,10 +1067,51 @@
         </w:numPr>
       </w:pPr>
       <w:r>
-        <w:t>Biologie (</w:t>
-      </w:r>
-      <w:r>
-        <w:t>musculaire, squelettique, neural, …)</w:t>
+        <w:t xml:space="preserve">Paragraphe introductif (1 </w:t>
+      </w:r>
+      <w:r>
+        <w:rPr>
+          <w:bCs/>
+        </w:rPr>
+        <w:t>§</w:t>
+      </w:r>
+      <w:r>
+        <w:rPr>
+          <w:bCs/>
+        </w:rPr>
+        <w:t xml:space="preserve"> -&gt; </w:t>
+      </w:r>
+      <w:r>
+        <w:rPr>
+          <w:bCs/>
+          <w:highlight w:val="yellow"/>
+        </w:rPr>
+        <w:t>comprendre et/ou reproduire le mouvement humain [bio-mimétisme, bio-inspiration, etc…]</w:t>
+      </w:r>
+      <w:r>
+        <w:rPr>
+          <w:bCs/>
+        </w:rPr>
+        <w:t>)</w:t>
+      </w:r>
+    </w:p>
+    <w:p>
+      <w:pPr>
+        <w:pStyle w:val="Titre3"/>
+      </w:pPr>
+      <w:r>
+        <w:t>Champ de recherche des sciences du mouvement humain</w:t>
+      </w:r>
+    </w:p>
+    <w:p>
+      <w:pPr>
+        <w:pStyle w:val="Titre4"/>
+      </w:pPr>
+      <w:r>
+        <w:t>Motivations</w:t>
+      </w:r>
+      <w:r>
+        <w:t xml:space="preserve"> </w:t>
       </w:r>
     </w:p>
     <w:p>
@@ -328,21 +1123,7 @@
         </w:numPr>
       </w:pPr>
       <w:r>
-        <w:t>Comportemental (</w:t>
-      </w:r>
-      <w:r>
-        <w:t>foule</w:t>
-      </w:r>
-      <w:r>
-        <w:t>, …)</w:t>
-      </w:r>
-    </w:p>
-    <w:p>
-      <w:pPr>
-        <w:pStyle w:val="Titre4"/>
-      </w:pPr>
-      <w:r>
-        <w:t>Nature des mouvements</w:t>
+        <w:t>Médical : soigner / réparer / prévenir</w:t>
       </w:r>
     </w:p>
     <w:p>
@@ -354,10 +1135,15 @@
         </w:numPr>
       </w:pPr>
       <w:r>
-        <w:t>Discrets</w:t>
-      </w:r>
-      <w:r>
-        <w:t xml:space="preserve"> (pointage, …)</w:t>
+        <w:t xml:space="preserve">Améliorer les performances (sport, </w:t>
+      </w:r>
+      <w:proofErr w:type="spellStart"/>
+      <w:r>
+        <w:t>trans</w:t>
+      </w:r>
+      <w:proofErr w:type="spellEnd"/>
+      <w:r>
+        <w:t>-humanisme, …)</w:t>
       </w:r>
     </w:p>
     <w:p>
@@ -369,29 +1155,7 @@
         </w:numPr>
       </w:pPr>
       <w:r>
-        <w:t>Rythmiques (</w:t>
-      </w:r>
-      <w:r>
-        <w:t xml:space="preserve">marche, </w:t>
-      </w:r>
-      <w:r>
-        <w:t>travaux de Guillaume A., …)</w:t>
-      </w:r>
-    </w:p>
-    <w:p>
-      <w:pPr>
-        <w:pStyle w:val="Titre3"/>
-      </w:pPr>
-      <w:r>
-        <w:t>Modélisation du comportement humain en impédance du membre supérieur</w:t>
-      </w:r>
-    </w:p>
-    <w:p>
-      <w:pPr>
-        <w:pStyle w:val="Titre4"/>
-      </w:pPr>
-      <w:r>
-        <w:t>Type de modélisations</w:t>
+        <w:t>Comprendre l’origine du mouvement</w:t>
       </w:r>
     </w:p>
     <w:p>
@@ -403,30 +1167,24 @@
         </w:numPr>
       </w:pPr>
       <w:r>
-        <w:t>Biologique (</w:t>
-      </w:r>
-      <w:r>
-        <w:t>Articulaire</w:t>
-      </w:r>
-      <w:r>
-        <w:t xml:space="preserve"> [Hogan, </w:t>
-      </w:r>
-      <w:proofErr w:type="spellStart"/>
-      <w:r>
-        <w:t>Burdet</w:t>
-      </w:r>
-      <w:proofErr w:type="spellEnd"/>
-      <w:r>
-        <w:t>…],</w:t>
+        <w:t>R</w:t>
+      </w:r>
+      <w:r>
+        <w:t>eproduire les performances</w:t>
+      </w:r>
+      <w:r>
+        <w:t xml:space="preserve"> biologiques</w:t>
+      </w:r>
+    </w:p>
+    <w:p>
+      <w:pPr>
+        <w:pStyle w:val="Titre4"/>
+      </w:pPr>
+      <w:r>
+        <w:t>Genèse de la Science du Mouvement Humain</w:t>
       </w:r>
       <w:r>
         <w:t xml:space="preserve"> </w:t>
-      </w:r>
-      <w:r>
-        <w:t>Cartésienne</w:t>
-      </w:r>
-      <w:r>
-        <w:t>)</w:t>
       </w:r>
     </w:p>
     <w:p>
@@ -438,18 +1196,43 @@
         </w:numPr>
       </w:pPr>
       <w:r>
-        <w:t>Comportemental (Cartésien [Billard])</w:t>
-      </w:r>
-    </w:p>
-    <w:p>
-      <w:pPr>
-        <w:pStyle w:val="Titre4"/>
-      </w:pPr>
-      <w:r>
-        <w:t>Impédance mécanique</w:t>
-      </w:r>
-      <w:r>
+        <w:t xml:space="preserve">Rappel sur la biologie du corps humain </w:t>
+      </w:r>
+      <w:r>
+        <w:rPr>
+          <w:bCs/>
+        </w:rPr>
+        <w:t>(</w:t>
+      </w:r>
+      <w:r>
+        <w:rPr>
+          <w:bCs/>
+        </w:rPr>
+        <w:t>4</w:t>
+      </w:r>
+      <w:r>
+        <w:rPr>
+          <w:bCs/>
+        </w:rPr>
+        <w:t xml:space="preserve"> – </w:t>
+      </w:r>
+      <w:r>
+        <w:rPr>
+          <w:bCs/>
+        </w:rPr>
+        <w:t>5</w:t>
+      </w:r>
+      <w:r>
+        <w:rPr>
+          <w:bCs/>
+        </w:rPr>
         <w:t xml:space="preserve"> </w:t>
+      </w:r>
+      <w:r>
+        <w:rPr>
+          <w:bCs/>
+        </w:rPr>
+        <w:t>§)</w:t>
       </w:r>
     </w:p>
     <w:p>
@@ -461,46 +1244,440 @@
         </w:numPr>
       </w:pPr>
       <w:r>
-        <w:t> ????</w:t>
-      </w:r>
-    </w:p>
-    <w:p>
-      <w:pPr>
-        <w:pStyle w:val="Titre2"/>
-      </w:pPr>
-      <w:r>
-        <w:t>Problématiques et contributions</w:t>
-      </w:r>
-    </w:p>
-    <w:p>
-      <w:pPr>
-        <w:pStyle w:val="Titre4"/>
-      </w:pPr>
-      <w:r>
-        <w:t>Complexité de l’estimation d’impédance</w:t>
-      </w:r>
-    </w:p>
-    <w:p>
-      <w:pPr>
-        <w:pStyle w:val="Titre4"/>
-      </w:pPr>
-      <w:r>
-        <w:t>Influence de l’impédance sur une tâche hybride</w:t>
-      </w:r>
-    </w:p>
-    <w:p>
-      <w:pPr>
-        <w:pStyle w:val="Titre4"/>
-      </w:pPr>
-      <w:r>
-        <w:t>Interactions humain-robot</w:t>
-      </w:r>
-    </w:p>
-    <w:p/>
-    <w:p>
+        <w:t>Théories de génération et coordination du mouvement</w:t>
+      </w:r>
+      <w:r>
+        <w:t xml:space="preserve"> </w:t>
+      </w:r>
+      <w:r>
+        <w:rPr>
+          <w:bCs/>
+        </w:rPr>
+        <w:t xml:space="preserve">(4 – 5 </w:t>
+      </w:r>
+      <w:r>
+        <w:rPr>
+          <w:bCs/>
+        </w:rPr>
+        <w:t>§)</w:t>
+      </w:r>
+    </w:p>
+    <w:p>
+      <w:pPr>
+        <w:pStyle w:val="Paragraphedeliste"/>
+        <w:numPr>
+          <w:ilvl w:val="1"/>
+          <w:numId w:val="27"/>
+        </w:numPr>
+      </w:pPr>
+      <w:r>
+        <w:t>Point d’équilibre [Flash</w:t>
+      </w:r>
+      <w:r>
+        <w:t xml:space="preserve">, </w:t>
+      </w:r>
+      <w:proofErr w:type="spellStart"/>
+      <w:r>
+        <w:t>Popescu</w:t>
+      </w:r>
+      <w:proofErr w:type="spellEnd"/>
+      <w:r>
+        <w:t>]</w:t>
+      </w:r>
       <w:bookmarkStart w:id="0" w:name="_GoBack"/>
       <w:bookmarkEnd w:id="0"/>
     </w:p>
+    <w:p>
+      <w:pPr>
+        <w:pStyle w:val="Paragraphedeliste"/>
+        <w:numPr>
+          <w:ilvl w:val="1"/>
+          <w:numId w:val="27"/>
+        </w:numPr>
+      </w:pPr>
+      <w:r>
+        <w:t>Primitives motrices [</w:t>
+      </w:r>
+      <w:proofErr w:type="spellStart"/>
+      <w:r>
+        <w:t>Degallier</w:t>
+      </w:r>
+      <w:proofErr w:type="spellEnd"/>
+      <w:r>
+        <w:t>]</w:t>
+      </w:r>
+    </w:p>
+    <w:p>
+      <w:pPr>
+        <w:pStyle w:val="Paragraphedeliste"/>
+        <w:numPr>
+          <w:ilvl w:val="1"/>
+          <w:numId w:val="27"/>
+        </w:numPr>
+      </w:pPr>
+      <w:r>
+        <w:t>Modélisation interne [</w:t>
+      </w:r>
+      <w:proofErr w:type="spellStart"/>
+      <w:r>
+        <w:t>Hinder&amp;Miller</w:t>
+      </w:r>
+      <w:proofErr w:type="spellEnd"/>
+      <w:r>
+        <w:t xml:space="preserve">, </w:t>
+      </w:r>
+      <w:proofErr w:type="spellStart"/>
+      <w:r>
+        <w:t>Danion</w:t>
+      </w:r>
+      <w:proofErr w:type="spellEnd"/>
+      <w:r>
+        <w:t>]</w:t>
+      </w:r>
+    </w:p>
+    <w:p>
+      <w:pPr>
+        <w:pStyle w:val="Paragraphedeliste"/>
+        <w:numPr>
+          <w:ilvl w:val="1"/>
+          <w:numId w:val="27"/>
+        </w:numPr>
+      </w:pPr>
+      <w:r>
+        <w:t>Contrôle optimal ?</w:t>
+      </w:r>
+    </w:p>
+    <w:p>
+      <w:pPr>
+        <w:pStyle w:val="Titre4"/>
+      </w:pPr>
+      <w:r>
+        <w:t>Nature des mouvements</w:t>
+      </w:r>
+      <w:r>
+        <w:t xml:space="preserve"> </w:t>
+      </w:r>
+    </w:p>
+    <w:p>
+      <w:pPr>
+        <w:pStyle w:val="Paragraphedeliste"/>
+        <w:numPr>
+          <w:ilvl w:val="0"/>
+          <w:numId w:val="27"/>
+        </w:numPr>
+      </w:pPr>
+      <w:r>
+        <w:t>Discrets</w:t>
+      </w:r>
+      <w:r>
+        <w:t xml:space="preserve"> (pointage, </w:t>
+      </w:r>
+      <w:r>
+        <w:t>tâches complexes</w:t>
+      </w:r>
+      <w:r>
+        <w:t>)</w:t>
+      </w:r>
+    </w:p>
+    <w:p>
+      <w:pPr>
+        <w:pStyle w:val="Paragraphedeliste"/>
+        <w:numPr>
+          <w:ilvl w:val="0"/>
+          <w:numId w:val="27"/>
+        </w:numPr>
+      </w:pPr>
+      <w:r>
+        <w:t>Rythmiques (</w:t>
+      </w:r>
+      <w:proofErr w:type="spellStart"/>
+      <w:r>
+        <w:t>CPGs</w:t>
+      </w:r>
+      <w:proofErr w:type="spellEnd"/>
+      <w:r>
+        <w:t xml:space="preserve">, </w:t>
+      </w:r>
+      <w:r>
+        <w:t xml:space="preserve">marche, </w:t>
+      </w:r>
+      <w:r>
+        <w:t xml:space="preserve">travaux de Guillaume A., </w:t>
+      </w:r>
+      <w:r>
+        <w:t>ponçage, …</w:t>
+      </w:r>
+      <w:r>
+        <w:t>)</w:t>
+      </w:r>
+    </w:p>
+    <w:p>
+      <w:pPr>
+        <w:pStyle w:val="Paragraphedeliste"/>
+        <w:numPr>
+          <w:ilvl w:val="0"/>
+          <w:numId w:val="27"/>
+        </w:numPr>
+      </w:pPr>
+      <w:r>
+        <w:t>Unification des mouvements [</w:t>
+      </w:r>
+      <w:proofErr w:type="spellStart"/>
+      <w:r>
+        <w:t>Sternad</w:t>
+      </w:r>
+      <w:proofErr w:type="spellEnd"/>
+      <w:r>
+        <w:t xml:space="preserve">, </w:t>
+      </w:r>
+      <w:proofErr w:type="spellStart"/>
+      <w:r>
+        <w:t>Degallier</w:t>
+      </w:r>
+      <w:proofErr w:type="spellEnd"/>
+      <w:r>
+        <w:t>]</w:t>
+      </w:r>
+    </w:p>
+    <w:p>
+      <w:pPr>
+        <w:pStyle w:val="Paragraphedeliste"/>
+        <w:numPr>
+          <w:ilvl w:val="0"/>
+          <w:numId w:val="27"/>
+        </w:numPr>
+      </w:pPr>
+      <w:r>
+        <w:t>(</w:t>
+      </w:r>
+      <w:proofErr w:type="gramStart"/>
+      <w:r>
+        <w:t>lien</w:t>
+      </w:r>
+      <w:r>
+        <w:t>s</w:t>
+      </w:r>
+      <w:proofErr w:type="gramEnd"/>
+      <w:r>
+        <w:t xml:space="preserve"> avec la robotique, tâche</w:t>
+      </w:r>
+      <w:r>
+        <w:t>s</w:t>
+      </w:r>
+      <w:r>
+        <w:t xml:space="preserve"> industrielle</w:t>
+      </w:r>
+      <w:r>
+        <w:t>s</w:t>
+      </w:r>
+      <w:r>
+        <w:t xml:space="preserve"> ou du quotidien)</w:t>
+      </w:r>
+    </w:p>
+    <w:p>
+      <w:pPr>
+        <w:pStyle w:val="Titre3"/>
+      </w:pPr>
+      <w:r>
+        <w:t>Modélisation du comportement humain en impédance du membre supérieur</w:t>
+      </w:r>
+    </w:p>
+    <w:p>
+      <w:pPr>
+        <w:pStyle w:val="Titre4"/>
+      </w:pPr>
+      <w:r>
+        <w:t>Définition de l’impédance mécanique</w:t>
+      </w:r>
+    </w:p>
+    <w:p>
+      <w:pPr>
+        <w:pStyle w:val="Paragraphedeliste"/>
+        <w:numPr>
+          <w:ilvl w:val="0"/>
+          <w:numId w:val="27"/>
+        </w:numPr>
+      </w:pPr>
+      <w:r>
+        <w:t>Définition générale de l’impédance et de l’admittance (flux/potentiel)</w:t>
+      </w:r>
+    </w:p>
+    <w:p>
+      <w:pPr>
+        <w:pStyle w:val="Paragraphedeliste"/>
+        <w:numPr>
+          <w:ilvl w:val="0"/>
+          <w:numId w:val="27"/>
+        </w:numPr>
+      </w:pPr>
+      <w:r>
+        <w:t xml:space="preserve">Analogie avec les autres grandeurs physiques (électrique, </w:t>
+      </w:r>
+      <w:proofErr w:type="gramStart"/>
+      <w:r>
+        <w:t>acoustique,  …</w:t>
+      </w:r>
+      <w:proofErr w:type="gramEnd"/>
+      <w:r>
+        <w:t>)</w:t>
+      </w:r>
+      <w:r>
+        <w:t xml:space="preserve"> et historique de l’utilisation de ces concepts</w:t>
+      </w:r>
+    </w:p>
+    <w:p>
+      <w:pPr>
+        <w:pStyle w:val="Paragraphedeliste"/>
+        <w:numPr>
+          <w:ilvl w:val="0"/>
+          <w:numId w:val="27"/>
+        </w:numPr>
+      </w:pPr>
+      <w:r>
+        <w:t>Cas de l’impédance mécanique</w:t>
+      </w:r>
+    </w:p>
+    <w:p>
+      <w:pPr>
+        <w:pStyle w:val="Titre4"/>
+      </w:pPr>
+      <w:r>
+        <w:t>Type de modélisations</w:t>
+      </w:r>
+    </w:p>
+    <w:p>
+      <w:pPr>
+        <w:pStyle w:val="Paragraphedeliste"/>
+        <w:numPr>
+          <w:ilvl w:val="0"/>
+          <w:numId w:val="27"/>
+        </w:numPr>
+        <w:rPr>
+          <w:highlight w:val="yellow"/>
+        </w:rPr>
+      </w:pPr>
+      <w:r>
+        <w:rPr>
+          <w:highlight w:val="yellow"/>
+        </w:rPr>
+        <w:t>Biologique (</w:t>
+      </w:r>
+      <w:r>
+        <w:rPr>
+          <w:highlight w:val="yellow"/>
+        </w:rPr>
+        <w:t>Articulaire</w:t>
+      </w:r>
+      <w:r>
+        <w:rPr>
+          <w:highlight w:val="yellow"/>
+        </w:rPr>
+        <w:t xml:space="preserve"> [</w:t>
+      </w:r>
+      <w:proofErr w:type="spellStart"/>
+      <w:r>
+        <w:rPr>
+          <w:highlight w:val="yellow"/>
+        </w:rPr>
+        <w:t>Hogan</w:t>
+      </w:r>
+      <w:proofErr w:type="spellEnd"/>
+      <w:r>
+        <w:rPr>
+          <w:highlight w:val="yellow"/>
+        </w:rPr>
+        <w:t xml:space="preserve">, </w:t>
+      </w:r>
+      <w:proofErr w:type="spellStart"/>
+      <w:r>
+        <w:rPr>
+          <w:highlight w:val="yellow"/>
+        </w:rPr>
+        <w:t>Burdet</w:t>
+      </w:r>
+      <w:proofErr w:type="spellEnd"/>
+      <w:r>
+        <w:rPr>
+          <w:highlight w:val="yellow"/>
+        </w:rPr>
+        <w:t>…], Cartésienne)</w:t>
+      </w:r>
+    </w:p>
+    <w:p>
+      <w:pPr>
+        <w:pStyle w:val="Paragraphedeliste"/>
+        <w:numPr>
+          <w:ilvl w:val="0"/>
+          <w:numId w:val="27"/>
+        </w:numPr>
+        <w:rPr>
+          <w:highlight w:val="yellow"/>
+        </w:rPr>
+      </w:pPr>
+      <w:r>
+        <w:rPr>
+          <w:highlight w:val="yellow"/>
+        </w:rPr>
+        <w:t>Comportemental (Cartésien [Billard])</w:t>
+      </w:r>
+    </w:p>
+    <w:p/>
+    <w:p>
+      <w:r>
+        <w:rPr>
+          <w:highlight w:val="yellow"/>
+        </w:rPr>
+        <w:t>Regrouper 1.b) et 2.a) sous un même sous chapitre, 1.a) donnant juste un context</w:t>
+      </w:r>
+      <w:r>
+        <w:rPr>
+          <w:highlight w:val="yellow"/>
+        </w:rPr>
+        <w:t>e</w:t>
+      </w:r>
+      <w:r>
+        <w:rPr>
+          <w:highlight w:val="yellow"/>
+        </w:rPr>
+        <w:t xml:space="preserve"> sans titre ?</w:t>
+      </w:r>
+    </w:p>
+    <w:p/>
+    <w:p>
+      <w:pPr>
+        <w:pStyle w:val="Titre2"/>
+      </w:pPr>
+      <w:r>
+        <w:lastRenderedPageBreak/>
+        <w:t>Problématiques et contributions</w:t>
+      </w:r>
+    </w:p>
+    <w:p>
+      <w:pPr>
+        <w:pStyle w:val="Titre4"/>
+      </w:pPr>
+      <w:r>
+        <w:t>Complexité de l’estimation d’impédance</w:t>
+      </w:r>
+    </w:p>
+    <w:p>
+      <w:pPr>
+        <w:pStyle w:val="Titre4"/>
+      </w:pPr>
+      <w:r>
+        <w:t>Influence de l’impédance sur une tâche hybride</w:t>
+      </w:r>
+    </w:p>
+    <w:p>
+      <w:pPr>
+        <w:pStyle w:val="Titre4"/>
+      </w:pPr>
+      <w:r>
+        <w:t>Interactions humain-robot</w:t>
+      </w:r>
+    </w:p>
+    <w:p/>
+    <w:p/>
     <w:p/>
     <w:p/>
     <w:p/>
@@ -1404,7 +2581,7 @@
 </file>
 
 <file path=word/numbering.xml><?xml version="1.0" encoding="utf-8"?>
-<w:numbering xmlns:wpc="http://schemas.microsoft.com/office/word/2010/wordprocessingCanvas" xmlns:cx="http://schemas.microsoft.com/office/drawing/2014/chartex" xmlns:cx1="http://schemas.microsoft.com/office/drawing/2015/9/8/chartex" xmlns:cx2="http://schemas.microsoft.com/office/drawing/2015/10/21/chartex" xmlns:cx3="http://schemas.microsoft.com/office/drawing/2016/5/9/chartex" xmlns:cx4="http://schemas.microsoft.com/office/drawing/2016/5/10/chartex" xmlns:cx5="http://schemas.microsoft.com/office/drawing/2016/5/11/chartex" xmlns:cx6="http://schemas.microsoft.com/office/drawing/2016/5/12/chartex" xmlns:cx7="http://schemas.microsoft.com/office/drawing/2016/5/13/chartex" xmlns:cx8="http://schemas.microsoft.com/office/drawing/2016/5/14/chartex" xmlns:mc="http://schemas.openxmlformats.org/markup-compatibility/2006" xmlns:aink="http://schemas.microsoft.com/office/drawing/2016/ink" xmlns:am3d="http://schemas.microsoft.com/office/drawing/2017/model3d" xmlns:o="urn:schemas-microsoft-com:office:office" xmlns:r="http://schemas.openxmlformats.org/officeDocument/2006/relationships" xmlns:m="http://schemas.openxmlformats.org/officeDocument/2006/math" xmlns:v="urn:schemas-microsoft-com:vml" xmlns:wp14="http://schemas.microsoft.com/office/word/2010/wordprocessingDrawing" xmlns:wp="http://schemas.openxmlformats.org/drawingml/2006/wordprocessingDrawing" xmlns:w10="urn:schemas-microsoft-com:office:word" xmlns:w="http://schemas.openxmlformats.org/wordprocessingml/2006/main" xmlns:w14="http://schemas.microsoft.com/office/word/2010/wordml" xmlns:w15="http://schemas.microsoft.com/office/word/2012/wordml" xmlns:w16cid="http://schemas.microsoft.com/office/word/2016/wordml/cid" xmlns:w16se="http://schemas.microsoft.com/office/word/2015/wordml/symex" xmlns:wpg="http://schemas.microsoft.com/office/word/2010/wordprocessingGroup" xmlns:wpi="http://schemas.microsoft.com/office/word/2010/wordprocessingInk" xmlns:wne="http://schemas.microsoft.com/office/word/2006/wordml" xmlns:wps="http://schemas.microsoft.com/office/word/2010/wordprocessingShape" mc:Ignorable="w14 w15 w16se w16cid wp14">
+<w:numbering xmlns:wpc="http://schemas.microsoft.com/office/word/2010/wordprocessingCanvas" xmlns:cx="http://schemas.microsoft.com/office/drawing/2014/chartex" xmlns:cx1="http://schemas.microsoft.com/office/drawing/2015/9/8/chartex" xmlns:mc="http://schemas.openxmlformats.org/markup-compatibility/2006" xmlns:o="urn:schemas-microsoft-com:office:office" xmlns:r="http://schemas.openxmlformats.org/officeDocument/2006/relationships" xmlns:m="http://schemas.openxmlformats.org/officeDocument/2006/math" xmlns:v="urn:schemas-microsoft-com:vml" xmlns:wp14="http://schemas.microsoft.com/office/word/2010/wordprocessingDrawing" xmlns:wp="http://schemas.openxmlformats.org/drawingml/2006/wordprocessingDrawing" xmlns:w10="urn:schemas-microsoft-com:office:word" xmlns:w="http://schemas.openxmlformats.org/wordprocessingml/2006/main" xmlns:w14="http://schemas.microsoft.com/office/word/2010/wordml" xmlns:w15="http://schemas.microsoft.com/office/word/2012/wordml" xmlns:w16se="http://schemas.microsoft.com/office/word/2015/wordml/symex" xmlns:wpg="http://schemas.microsoft.com/office/word/2010/wordprocessingGroup" xmlns:wpi="http://schemas.microsoft.com/office/word/2010/wordprocessingInk" xmlns:wne="http://schemas.microsoft.com/office/word/2006/wordml" xmlns:wps="http://schemas.microsoft.com/office/word/2010/wordprocessingShape" mc:Ignorable="w14 w15 w16se wp14">
   <w:abstractNum w:abstractNumId="0" w15:restartNumberingAfterBreak="0">
     <w:nsid w:val="072B2234"/>
     <w:multiLevelType w:val="multilevel"/>
@@ -1662,7 +2839,7 @@
       <w:lvlText w:val="%3."/>
       <w:lvlJc w:val="left"/>
       <w:pPr>
-        <w:ind w:left="1440" w:firstLine="0"/>
+        <w:ind w:left="5954" w:firstLine="0"/>
       </w:pPr>
     </w:lvl>
     <w:lvl w:ilvl="3">
@@ -3368,6 +4545,119 @@
     </w:lvl>
   </w:abstractNum>
   <w:abstractNum w:abstractNumId="18" w15:restartNumberingAfterBreak="0">
+    <w:nsid w:val="50871B02"/>
+    <w:multiLevelType w:val="hybridMultilevel"/>
+    <w:tmpl w:val="90DCB67C"/>
+    <w:lvl w:ilvl="0" w:tplc="040C000F">
+      <w:start w:val="1"/>
+      <w:numFmt w:val="decimal"/>
+      <w:lvlText w:val="%1."/>
+      <w:lvlJc w:val="left"/>
+      <w:pPr>
+        <w:ind w:left="3192" w:hanging="360"/>
+      </w:pPr>
+      <w:rPr>
+        <w:rFonts w:hint="default"/>
+      </w:rPr>
+    </w:lvl>
+    <w:lvl w:ilvl="1" w:tplc="040C0003">
+      <w:start w:val="1"/>
+      <w:numFmt w:val="bullet"/>
+      <w:lvlText w:val="o"/>
+      <w:lvlJc w:val="left"/>
+      <w:pPr>
+        <w:ind w:left="3912" w:hanging="360"/>
+      </w:pPr>
+      <w:rPr>
+        <w:rFonts w:ascii="Courier New" w:hAnsi="Courier New" w:cs="Courier New" w:hint="default"/>
+      </w:rPr>
+    </w:lvl>
+    <w:lvl w:ilvl="2" w:tplc="040C0005" w:tentative="1">
+      <w:start w:val="1"/>
+      <w:numFmt w:val="bullet"/>
+      <w:lvlText w:val=""/>
+      <w:lvlJc w:val="left"/>
+      <w:pPr>
+        <w:ind w:left="4632" w:hanging="360"/>
+      </w:pPr>
+      <w:rPr>
+        <w:rFonts w:ascii="Wingdings" w:hAnsi="Wingdings" w:hint="default"/>
+      </w:rPr>
+    </w:lvl>
+    <w:lvl w:ilvl="3" w:tplc="040C0001" w:tentative="1">
+      <w:start w:val="1"/>
+      <w:numFmt w:val="bullet"/>
+      <w:lvlText w:val=""/>
+      <w:lvlJc w:val="left"/>
+      <w:pPr>
+        <w:ind w:left="5352" w:hanging="360"/>
+      </w:pPr>
+      <w:rPr>
+        <w:rFonts w:ascii="Symbol" w:hAnsi="Symbol" w:hint="default"/>
+      </w:rPr>
+    </w:lvl>
+    <w:lvl w:ilvl="4" w:tplc="040C0003" w:tentative="1">
+      <w:start w:val="1"/>
+      <w:numFmt w:val="bullet"/>
+      <w:lvlText w:val="o"/>
+      <w:lvlJc w:val="left"/>
+      <w:pPr>
+        <w:ind w:left="6072" w:hanging="360"/>
+      </w:pPr>
+      <w:rPr>
+        <w:rFonts w:ascii="Courier New" w:hAnsi="Courier New" w:cs="Courier New" w:hint="default"/>
+      </w:rPr>
+    </w:lvl>
+    <w:lvl w:ilvl="5" w:tplc="040C0005" w:tentative="1">
+      <w:start w:val="1"/>
+      <w:numFmt w:val="bullet"/>
+      <w:lvlText w:val=""/>
+      <w:lvlJc w:val="left"/>
+      <w:pPr>
+        <w:ind w:left="6792" w:hanging="360"/>
+      </w:pPr>
+      <w:rPr>
+        <w:rFonts w:ascii="Wingdings" w:hAnsi="Wingdings" w:hint="default"/>
+      </w:rPr>
+    </w:lvl>
+    <w:lvl w:ilvl="6" w:tplc="040C0001" w:tentative="1">
+      <w:start w:val="1"/>
+      <w:numFmt w:val="bullet"/>
+      <w:lvlText w:val=""/>
+      <w:lvlJc w:val="left"/>
+      <w:pPr>
+        <w:ind w:left="7512" w:hanging="360"/>
+      </w:pPr>
+      <w:rPr>
+        <w:rFonts w:ascii="Symbol" w:hAnsi="Symbol" w:hint="default"/>
+      </w:rPr>
+    </w:lvl>
+    <w:lvl w:ilvl="7" w:tplc="040C0003" w:tentative="1">
+      <w:start w:val="1"/>
+      <w:numFmt w:val="bullet"/>
+      <w:lvlText w:val="o"/>
+      <w:lvlJc w:val="left"/>
+      <w:pPr>
+        <w:ind w:left="8232" w:hanging="360"/>
+      </w:pPr>
+      <w:rPr>
+        <w:rFonts w:ascii="Courier New" w:hAnsi="Courier New" w:cs="Courier New" w:hint="default"/>
+      </w:rPr>
+    </w:lvl>
+    <w:lvl w:ilvl="8" w:tplc="040C0005" w:tentative="1">
+      <w:start w:val="1"/>
+      <w:numFmt w:val="bullet"/>
+      <w:lvlText w:val=""/>
+      <w:lvlJc w:val="left"/>
+      <w:pPr>
+        <w:ind w:left="8952" w:hanging="360"/>
+      </w:pPr>
+      <w:rPr>
+        <w:rFonts w:ascii="Wingdings" w:hAnsi="Wingdings" w:hint="default"/>
+      </w:rPr>
+    </w:lvl>
+  </w:abstractNum>
+  <w:abstractNum w:abstractNumId="19" w15:restartNumberingAfterBreak="0">
     <w:nsid w:val="530D6FB6"/>
     <w:multiLevelType w:val="multilevel"/>
     <w:tmpl w:val="05F4DE36"/>
@@ -3453,7 +4743,7 @@
       </w:pPr>
     </w:lvl>
   </w:abstractNum>
-  <w:abstractNum w:abstractNumId="19" w15:restartNumberingAfterBreak="0">
+  <w:abstractNum w:abstractNumId="20" w15:restartNumberingAfterBreak="0">
     <w:nsid w:val="62343F2B"/>
     <w:multiLevelType w:val="multilevel"/>
     <w:tmpl w:val="1DAA85A0"/>
@@ -3566,7 +4856,7 @@
       </w:pPr>
     </w:lvl>
   </w:abstractNum>
-  <w:abstractNum w:abstractNumId="20" w15:restartNumberingAfterBreak="0">
+  <w:abstractNum w:abstractNumId="21" w15:restartNumberingAfterBreak="0">
     <w:nsid w:val="6A476188"/>
     <w:multiLevelType w:val="multilevel"/>
     <w:tmpl w:val="AEEE80BA"/>
@@ -3679,7 +4969,7 @@
       </w:pPr>
     </w:lvl>
   </w:abstractNum>
-  <w:abstractNum w:abstractNumId="21" w15:restartNumberingAfterBreak="0">
+  <w:abstractNum w:abstractNumId="22" w15:restartNumberingAfterBreak="0">
     <w:nsid w:val="6E626369"/>
     <w:multiLevelType w:val="multilevel"/>
     <w:tmpl w:val="0E3E9BA4"/>
@@ -3792,7 +5082,7 @@
       </w:pPr>
     </w:lvl>
   </w:abstractNum>
-  <w:abstractNum w:abstractNumId="22" w15:restartNumberingAfterBreak="0">
+  <w:abstractNum w:abstractNumId="23" w15:restartNumberingAfterBreak="0">
     <w:nsid w:val="70BB0CE5"/>
     <w:multiLevelType w:val="multilevel"/>
     <w:tmpl w:val="040C0027"/>
@@ -3878,7 +5168,7 @@
       </w:pPr>
     </w:lvl>
   </w:abstractNum>
-  <w:abstractNum w:abstractNumId="23" w15:restartNumberingAfterBreak="0">
+  <w:abstractNum w:abstractNumId="24" w15:restartNumberingAfterBreak="0">
     <w:nsid w:val="710359A6"/>
     <w:multiLevelType w:val="multilevel"/>
     <w:tmpl w:val="1C1A9AD4"/>
@@ -3991,7 +5281,7 @@
       </w:pPr>
     </w:lvl>
   </w:abstractNum>
-  <w:abstractNum w:abstractNumId="24" w15:restartNumberingAfterBreak="0">
+  <w:abstractNum w:abstractNumId="25" w15:restartNumberingAfterBreak="0">
     <w:nsid w:val="79B558ED"/>
     <w:multiLevelType w:val="multilevel"/>
     <w:tmpl w:val="9C2A9412"/>
@@ -4104,7 +5394,7 @@
       </w:pPr>
     </w:lvl>
   </w:abstractNum>
-  <w:abstractNum w:abstractNumId="25" w15:restartNumberingAfterBreak="0">
+  <w:abstractNum w:abstractNumId="26" w15:restartNumberingAfterBreak="0">
     <w:nsid w:val="7B292B7C"/>
     <w:multiLevelType w:val="multilevel"/>
     <w:tmpl w:val="2DFC90B8"/>
@@ -4190,7 +5480,7 @@
       </w:pPr>
     </w:lvl>
   </w:abstractNum>
-  <w:abstractNum w:abstractNumId="26" w15:restartNumberingAfterBreak="0">
+  <w:abstractNum w:abstractNumId="27" w15:restartNumberingAfterBreak="0">
     <w:nsid w:val="7B59670C"/>
     <w:multiLevelType w:val="multilevel"/>
     <w:tmpl w:val="279E1B32"/>
@@ -4316,13 +5606,13 @@
     <w:abstractNumId w:val="7"/>
   </w:num>
   <w:num w:numId="5">
-    <w:abstractNumId w:val="21"/>
+    <w:abstractNumId w:val="22"/>
   </w:num>
   <w:num w:numId="6">
     <w:abstractNumId w:val="11"/>
   </w:num>
   <w:num w:numId="7">
-    <w:abstractNumId w:val="19"/>
+    <w:abstractNumId w:val="20"/>
   </w:num>
   <w:num w:numId="8">
     <w:abstractNumId w:val="12"/>
@@ -4343,22 +5633,22 @@
     <w:abstractNumId w:val="13"/>
   </w:num>
   <w:num w:numId="14">
-    <w:abstractNumId w:val="24"/>
+    <w:abstractNumId w:val="25"/>
   </w:num>
   <w:num w:numId="15">
-    <w:abstractNumId w:val="26"/>
+    <w:abstractNumId w:val="27"/>
   </w:num>
   <w:num w:numId="16">
     <w:abstractNumId w:val="6"/>
   </w:num>
   <w:num w:numId="17">
-    <w:abstractNumId w:val="23"/>
+    <w:abstractNumId w:val="24"/>
   </w:num>
   <w:num w:numId="18">
     <w:abstractNumId w:val="0"/>
   </w:num>
   <w:num w:numId="19">
-    <w:abstractNumId w:val="20"/>
+    <w:abstractNumId w:val="21"/>
   </w:num>
   <w:num w:numId="20">
     <w:abstractNumId w:val="1"/>
@@ -4370,13 +5660,13 @@
     <w:abstractNumId w:val="16"/>
   </w:num>
   <w:num w:numId="23">
-    <w:abstractNumId w:val="22"/>
+    <w:abstractNumId w:val="23"/>
   </w:num>
   <w:num w:numId="24">
-    <w:abstractNumId w:val="18"/>
+    <w:abstractNumId w:val="19"/>
   </w:num>
   <w:num w:numId="25">
-    <w:abstractNumId w:val="25"/>
+    <w:abstractNumId w:val="26"/>
   </w:num>
   <w:num w:numId="26">
     <w:abstractNumId w:val="2"/>
@@ -4384,11 +5674,14 @@
   <w:num w:numId="27">
     <w:abstractNumId w:val="5"/>
   </w:num>
+  <w:num w:numId="28">
+    <w:abstractNumId w:val="18"/>
+  </w:num>
 </w:numbering>
 </file>
 
 <file path=word/styles.xml><?xml version="1.0" encoding="utf-8"?>
-<w:styles xmlns:mc="http://schemas.openxmlformats.org/markup-compatibility/2006" xmlns:r="http://schemas.openxmlformats.org/officeDocument/2006/relationships" xmlns:w="http://schemas.openxmlformats.org/wordprocessingml/2006/main" xmlns:w14="http://schemas.microsoft.com/office/word/2010/wordml" xmlns:w15="http://schemas.microsoft.com/office/word/2012/wordml" xmlns:w16cid="http://schemas.microsoft.com/office/word/2016/wordml/cid" xmlns:w16se="http://schemas.microsoft.com/office/word/2015/wordml/symex" mc:Ignorable="w14 w15 w16se w16cid">
+<w:styles xmlns:mc="http://schemas.openxmlformats.org/markup-compatibility/2006" xmlns:r="http://schemas.openxmlformats.org/officeDocument/2006/relationships" xmlns:w="http://schemas.openxmlformats.org/wordprocessingml/2006/main" xmlns:w14="http://schemas.microsoft.com/office/word/2010/wordml" xmlns:w15="http://schemas.microsoft.com/office/word/2012/wordml" xmlns:w16se="http://schemas.microsoft.com/office/word/2015/wordml/symex" mc:Ignorable="w14 w15 w16se">
   <w:docDefaults>
     <w:rPrDefault>
       <w:rPr>
@@ -4404,7 +5697,7 @@
       </w:pPr>
     </w:pPrDefault>
   </w:docDefaults>
-  <w:latentStyles w:defLockedState="0" w:defUIPriority="99" w:defSemiHidden="0" w:defUnhideWhenUsed="0" w:defQFormat="0" w:count="375">
+  <w:latentStyles w:defLockedState="0" w:defUIPriority="99" w:defSemiHidden="0" w:defUnhideWhenUsed="0" w:defQFormat="0" w:count="371">
     <w:lsdException w:name="Normal" w:uiPriority="0" w:qFormat="1"/>
     <w:lsdException w:name="heading 1" w:uiPriority="9" w:qFormat="1"/>
     <w:lsdException w:name="heading 2" w:semiHidden="1" w:uiPriority="9" w:unhideWhenUsed="1" w:qFormat="1"/>
@@ -4776,10 +6069,6 @@
     <w:lsdException w:name="List Table 5 Dark Accent 6" w:uiPriority="50"/>
     <w:lsdException w:name="List Table 6 Colorful Accent 6" w:uiPriority="51"/>
     <w:lsdException w:name="List Table 7 Colorful Accent 6" w:uiPriority="52"/>
-    <w:lsdException w:name="Mention" w:semiHidden="1" w:unhideWhenUsed="1"/>
-    <w:lsdException w:name="Smart Hyperlink" w:semiHidden="1" w:unhideWhenUsed="1"/>
-    <w:lsdException w:name="Hashtag" w:semiHidden="1" w:unhideWhenUsed="1"/>
-    <w:lsdException w:name="Unresolved Mention" w:semiHidden="1" w:unhideWhenUsed="1"/>
   </w:latentStyles>
   <w:style w:type="paragraph" w:default="1" w:styleId="Normal">
     <w:name w:val="Normal"/>
@@ -4856,6 +6145,7 @@
         <w:numId w:val="26"/>
       </w:numPr>
       <w:spacing w:before="40" w:after="0"/>
+      <w:ind w:left="1440"/>
       <w:outlineLvl w:val="2"/>
     </w:pPr>
     <w:rPr>
@@ -5205,6 +6495,36 @@
       <w:contextualSpacing/>
     </w:pPr>
   </w:style>
+  <w:style w:type="paragraph" w:styleId="Textedebulles">
+    <w:name w:val="Balloon Text"/>
+    <w:basedOn w:val="Normal"/>
+    <w:link w:val="TextedebullesCar"/>
+    <w:uiPriority w:val="99"/>
+    <w:semiHidden/>
+    <w:unhideWhenUsed/>
+    <w:rsid w:val="00B110FF"/>
+    <w:pPr>
+      <w:spacing w:after="0" w:line="240" w:lineRule="auto"/>
+    </w:pPr>
+    <w:rPr>
+      <w:rFonts w:ascii="Segoe UI" w:hAnsi="Segoe UI" w:cs="Segoe UI"/>
+      <w:sz w:val="18"/>
+      <w:szCs w:val="18"/>
+    </w:rPr>
+  </w:style>
+  <w:style w:type="character" w:customStyle="1" w:styleId="TextedebullesCar">
+    <w:name w:val="Texte de bulles Car"/>
+    <w:basedOn w:val="Policepardfaut"/>
+    <w:link w:val="Textedebulles"/>
+    <w:uiPriority w:val="99"/>
+    <w:semiHidden/>
+    <w:rsid w:val="00B110FF"/>
+    <w:rPr>
+      <w:rFonts w:ascii="Segoe UI" w:hAnsi="Segoe UI" w:cs="Segoe UI"/>
+      <w:sz w:val="18"/>
+      <w:szCs w:val="18"/>
+    </w:rPr>
+  </w:style>
 </w:styles>
 </file>
 

</xml_diff>

<commit_message>
Manuscript chapter 4 update
</commit_message>
<xml_diff>
--- a/Manuscript/preparatory/Plan prévisionnel mémoire de thèse V FO.docx
+++ b/Manuscript/preparatory/Plan prévisionnel mémoire de thèse V FO.docx
@@ -1,6 +1,6 @@
 
 <file path=word/document.xml><?xml version="1.0" encoding="utf-8"?>
-<w:document xmlns:wpc="http://schemas.microsoft.com/office/word/2010/wordprocessingCanvas" xmlns:cx="http://schemas.microsoft.com/office/drawing/2014/chartex" xmlns:cx1="http://schemas.microsoft.com/office/drawing/2015/9/8/chartex" xmlns:mc="http://schemas.openxmlformats.org/markup-compatibility/2006" xmlns:o="urn:schemas-microsoft-com:office:office" xmlns:r="http://schemas.openxmlformats.org/officeDocument/2006/relationships" xmlns:m="http://schemas.openxmlformats.org/officeDocument/2006/math" xmlns:v="urn:schemas-microsoft-com:vml" xmlns:wp14="http://schemas.microsoft.com/office/word/2010/wordprocessingDrawing" xmlns:wp="http://schemas.openxmlformats.org/drawingml/2006/wordprocessingDrawing" xmlns:w10="urn:schemas-microsoft-com:office:word" xmlns:w="http://schemas.openxmlformats.org/wordprocessingml/2006/main" xmlns:w14="http://schemas.microsoft.com/office/word/2010/wordml" xmlns:w15="http://schemas.microsoft.com/office/word/2012/wordml" xmlns:w16se="http://schemas.microsoft.com/office/word/2015/wordml/symex" xmlns:wpg="http://schemas.microsoft.com/office/word/2010/wordprocessingGroup" xmlns:wpi="http://schemas.microsoft.com/office/word/2010/wordprocessingInk" xmlns:wne="http://schemas.microsoft.com/office/word/2006/wordml" xmlns:wps="http://schemas.microsoft.com/office/word/2010/wordprocessingShape" mc:Ignorable="w14 w15 w16se wp14">
+<w:document xmlns:wpc="http://schemas.microsoft.com/office/word/2010/wordprocessingCanvas" xmlns:cx="http://schemas.microsoft.com/office/drawing/2014/chartex" xmlns:cx1="http://schemas.microsoft.com/office/drawing/2015/9/8/chartex" xmlns:cx2="http://schemas.microsoft.com/office/drawing/2015/10/21/chartex" xmlns:cx3="http://schemas.microsoft.com/office/drawing/2016/5/9/chartex" xmlns:cx4="http://schemas.microsoft.com/office/drawing/2016/5/10/chartex" xmlns:cx5="http://schemas.microsoft.com/office/drawing/2016/5/11/chartex" xmlns:cx6="http://schemas.microsoft.com/office/drawing/2016/5/12/chartex" xmlns:cx7="http://schemas.microsoft.com/office/drawing/2016/5/13/chartex" xmlns:cx8="http://schemas.microsoft.com/office/drawing/2016/5/14/chartex" xmlns:mc="http://schemas.openxmlformats.org/markup-compatibility/2006" xmlns:aink="http://schemas.microsoft.com/office/drawing/2016/ink" xmlns:am3d="http://schemas.microsoft.com/office/drawing/2017/model3d" xmlns:o="urn:schemas-microsoft-com:office:office" xmlns:r="http://schemas.openxmlformats.org/officeDocument/2006/relationships" xmlns:m="http://schemas.openxmlformats.org/officeDocument/2006/math" xmlns:v="urn:schemas-microsoft-com:vml" xmlns:wp14="http://schemas.microsoft.com/office/word/2010/wordprocessingDrawing" xmlns:wp="http://schemas.openxmlformats.org/drawingml/2006/wordprocessingDrawing" xmlns:w10="urn:schemas-microsoft-com:office:word" xmlns:w="http://schemas.openxmlformats.org/wordprocessingml/2006/main" xmlns:w14="http://schemas.microsoft.com/office/word/2010/wordml" xmlns:w15="http://schemas.microsoft.com/office/word/2012/wordml" xmlns:w16cex="http://schemas.microsoft.com/office/word/2018/wordml/cex" xmlns:w16cid="http://schemas.microsoft.com/office/word/2016/wordml/cid" xmlns:w16="http://schemas.microsoft.com/office/word/2018/wordml" xmlns:w16se="http://schemas.microsoft.com/office/word/2015/wordml/symex" xmlns:wpg="http://schemas.microsoft.com/office/word/2010/wordprocessingGroup" xmlns:wpi="http://schemas.microsoft.com/office/word/2010/wordprocessingInk" xmlns:wne="http://schemas.microsoft.com/office/word/2006/wordml" xmlns:wps="http://schemas.microsoft.com/office/word/2010/wordprocessingShape" mc:Ignorable="w14 w15 w16se w16cid w16 w16cex wp14">
   <w:body>
     <w:p>
       <w:pPr>
@@ -89,12 +89,10 @@
         <w:pStyle w:val="Titre2"/>
       </w:pPr>
       <w:proofErr w:type="spellStart"/>
-      <w:proofErr w:type="gramStart"/>
       <w:r>
         <w:t>any</w:t>
       </w:r>
       <w:proofErr w:type="spellEnd"/>
-      <w:proofErr w:type="gramEnd"/>
     </w:p>
     <w:p>
       <w:pPr>
@@ -1429,15 +1427,7 @@
         </w:numPr>
       </w:pPr>
       <w:r>
-        <w:t xml:space="preserve">Analogie avec les autres grandeurs physiques (électrique, </w:t>
-      </w:r>
-      <w:proofErr w:type="gramStart"/>
-      <w:r>
-        <w:t>acoustique,  …</w:t>
-      </w:r>
-      <w:proofErr w:type="gramEnd"/>
-      <w:r>
-        <w:t>)</w:t>
+        <w:t>Analogie avec les autres grandeurs physiques (électrique, acoustique,  …)</w:t>
       </w:r>
       <w:r>
         <w:t xml:space="preserve"> et historique de l’utilisation de ces concepts</w:t>
@@ -1728,7 +1718,6 @@
           <w:szCs w:val="18"/>
         </w:rPr>
       </w:pPr>
-      <w:bookmarkStart w:id="4" w:name="_GoBack"/>
       <w:r>
         <w:rPr>
           <w:rStyle w:val="normaltextrun"/>
@@ -2478,34 +2467,7 @@
           <w:sz w:val="22"/>
           <w:szCs w:val="22"/>
         </w:rPr>
-        <w:t xml:space="preserve">(Perreault </w:t>
-      </w:r>
-      <w:r>
-        <w:rPr>
-          <w:rStyle w:val="eop"/>
-          <w:rFonts w:eastAsiaTheme="majorEastAsia"/>
-          <w:sz w:val="22"/>
-          <w:szCs w:val="22"/>
-        </w:rPr>
-        <w:t>2001/2004</w:t>
-      </w:r>
-      <w:r>
-        <w:rPr>
-          <w:rStyle w:val="eop"/>
-          <w:rFonts w:eastAsiaTheme="majorEastAsia"/>
-          <w:sz w:val="22"/>
-          <w:szCs w:val="22"/>
-        </w:rPr>
-        <w:t xml:space="preserve">) </w:t>
-      </w:r>
-      <w:r>
-        <w:rPr>
-          <w:rStyle w:val="eop"/>
-          <w:rFonts w:eastAsiaTheme="majorEastAsia"/>
-          <w:sz w:val="22"/>
-          <w:szCs w:val="22"/>
-        </w:rPr>
-        <w:t>position</w:t>
+        <w:t>(Perreault 2001/2004) position</w:t>
       </w:r>
     </w:p>
     <w:p>
@@ -2767,25 +2729,7 @@
           <w:sz w:val="22"/>
           <w:szCs w:val="22"/>
         </w:rPr>
-        <w:t>(</w:t>
-      </w:r>
-      <w:r>
-        <w:rPr>
-          <w:rStyle w:val="eop"/>
-          <w:rFonts w:eastAsiaTheme="majorEastAsia"/>
-          <w:sz w:val="22"/>
-          <w:szCs w:val="22"/>
-        </w:rPr>
-        <w:t>Perreault 1999</w:t>
-      </w:r>
-      <w:r>
-        <w:rPr>
-          <w:rStyle w:val="eop"/>
-          <w:rFonts w:eastAsiaTheme="majorEastAsia"/>
-          <w:sz w:val="22"/>
-          <w:szCs w:val="22"/>
-        </w:rPr>
-        <w:t>)</w:t>
+        <w:t>(Perreault 1999)</w:t>
       </w:r>
     </w:p>
     <w:p>
@@ -2967,7 +2911,6 @@
         <w:t> </w:t>
       </w:r>
     </w:p>
-    <w:bookmarkEnd w:id="4"/>
     <w:p>
       <w:pPr>
         <w:pStyle w:val="paragraph"/>
@@ -3011,6 +2954,7 @@
         <w:ind w:left="360" w:firstLine="0"/>
         <w:textAlignment w:val="baseline"/>
         <w:rPr>
+          <w:rStyle w:val="eop"/>
           <w:sz w:val="22"/>
           <w:szCs w:val="22"/>
         </w:rPr>
@@ -3032,6 +2976,254 @@
           <w:szCs w:val="22"/>
         </w:rPr>
         <w:t> </w:t>
+      </w:r>
+    </w:p>
+    <w:p>
+      <w:pPr>
+        <w:pStyle w:val="paragraph"/>
+        <w:numPr>
+          <w:ilvl w:val="1"/>
+          <w:numId w:val="13"/>
+        </w:numPr>
+        <w:spacing w:before="0" w:beforeAutospacing="0" w:after="0" w:afterAutospacing="0"/>
+        <w:textAlignment w:val="baseline"/>
+        <w:rPr>
+          <w:rStyle w:val="eop"/>
+          <w:sz w:val="22"/>
+          <w:szCs w:val="22"/>
+        </w:rPr>
+      </w:pPr>
+      <w:r>
+        <w:rPr>
+          <w:rStyle w:val="eop"/>
+          <w:rFonts w:eastAsiaTheme="majorEastAsia"/>
+          <w:sz w:val="22"/>
+          <w:szCs w:val="22"/>
+        </w:rPr>
+        <w:t>Matériel</w:t>
+      </w:r>
+    </w:p>
+    <w:p>
+      <w:pPr>
+        <w:pStyle w:val="paragraph"/>
+        <w:numPr>
+          <w:ilvl w:val="2"/>
+          <w:numId w:val="13"/>
+        </w:numPr>
+        <w:spacing w:before="0" w:beforeAutospacing="0" w:after="0" w:afterAutospacing="0"/>
+        <w:textAlignment w:val="baseline"/>
+        <w:rPr>
+          <w:rStyle w:val="eop"/>
+          <w:sz w:val="22"/>
+          <w:szCs w:val="22"/>
+        </w:rPr>
+      </w:pPr>
+      <w:r>
+        <w:rPr>
+          <w:rStyle w:val="eop"/>
+          <w:rFonts w:eastAsiaTheme="majorEastAsia"/>
+          <w:sz w:val="22"/>
+          <w:szCs w:val="22"/>
+        </w:rPr>
+        <w:t>Robot</w:t>
+      </w:r>
+    </w:p>
+    <w:p>
+      <w:pPr>
+        <w:pStyle w:val="paragraph"/>
+        <w:numPr>
+          <w:ilvl w:val="2"/>
+          <w:numId w:val="13"/>
+        </w:numPr>
+        <w:spacing w:before="0" w:beforeAutospacing="0" w:after="0" w:afterAutospacing="0"/>
+        <w:textAlignment w:val="baseline"/>
+        <w:rPr>
+          <w:rStyle w:val="eop"/>
+          <w:sz w:val="22"/>
+          <w:szCs w:val="22"/>
+        </w:rPr>
+      </w:pPr>
+      <w:r>
+        <w:rPr>
+          <w:rStyle w:val="eop"/>
+          <w:rFonts w:eastAsiaTheme="majorEastAsia"/>
+          <w:sz w:val="22"/>
+          <w:szCs w:val="22"/>
+        </w:rPr>
+        <w:t>Capteurs</w:t>
+      </w:r>
+    </w:p>
+    <w:p>
+      <w:pPr>
+        <w:pStyle w:val="paragraph"/>
+        <w:numPr>
+          <w:ilvl w:val="2"/>
+          <w:numId w:val="13"/>
+        </w:numPr>
+        <w:spacing w:before="0" w:beforeAutospacing="0" w:after="0" w:afterAutospacing="0"/>
+        <w:textAlignment w:val="baseline"/>
+        <w:rPr>
+          <w:rStyle w:val="eop"/>
+          <w:sz w:val="22"/>
+          <w:szCs w:val="22"/>
+        </w:rPr>
+      </w:pPr>
+      <w:r>
+        <w:rPr>
+          <w:rStyle w:val="eop"/>
+          <w:rFonts w:eastAsiaTheme="majorEastAsia"/>
+          <w:sz w:val="22"/>
+          <w:szCs w:val="22"/>
+        </w:rPr>
+        <w:t>Synchronisation des équipements</w:t>
+      </w:r>
+    </w:p>
+    <w:p>
+      <w:pPr>
+        <w:pStyle w:val="paragraph"/>
+        <w:numPr>
+          <w:ilvl w:val="3"/>
+          <w:numId w:val="13"/>
+        </w:numPr>
+        <w:spacing w:before="0" w:beforeAutospacing="0" w:after="0" w:afterAutospacing="0"/>
+        <w:textAlignment w:val="baseline"/>
+        <w:rPr>
+          <w:rStyle w:val="eop"/>
+          <w:sz w:val="22"/>
+          <w:szCs w:val="22"/>
+        </w:rPr>
+      </w:pPr>
+      <w:r>
+        <w:rPr>
+          <w:rStyle w:val="eop"/>
+          <w:rFonts w:eastAsiaTheme="majorEastAsia"/>
+          <w:sz w:val="22"/>
+          <w:szCs w:val="22"/>
+        </w:rPr>
+        <w:t>ROS</w:t>
+      </w:r>
+    </w:p>
+    <w:p>
+      <w:pPr>
+        <w:pStyle w:val="paragraph"/>
+        <w:numPr>
+          <w:ilvl w:val="3"/>
+          <w:numId w:val="13"/>
+        </w:numPr>
+        <w:spacing w:before="0" w:beforeAutospacing="0" w:after="0" w:afterAutospacing="0"/>
+        <w:textAlignment w:val="baseline"/>
+        <w:rPr>
+          <w:rStyle w:val="eop"/>
+          <w:sz w:val="22"/>
+          <w:szCs w:val="22"/>
+        </w:rPr>
+      </w:pPr>
+      <w:r>
+        <w:rPr>
+          <w:rStyle w:val="eop"/>
+          <w:sz w:val="22"/>
+          <w:szCs w:val="22"/>
+        </w:rPr>
+        <w:t>Affichage</w:t>
+      </w:r>
+    </w:p>
+    <w:p>
+      <w:pPr>
+        <w:pStyle w:val="paragraph"/>
+        <w:numPr>
+          <w:ilvl w:val="1"/>
+          <w:numId w:val="13"/>
+        </w:numPr>
+        <w:spacing w:before="0" w:beforeAutospacing="0" w:after="0" w:afterAutospacing="0"/>
+        <w:textAlignment w:val="baseline"/>
+        <w:rPr>
+          <w:rStyle w:val="eop"/>
+          <w:sz w:val="22"/>
+          <w:szCs w:val="22"/>
+        </w:rPr>
+      </w:pPr>
+      <w:r>
+        <w:rPr>
+          <w:rStyle w:val="eop"/>
+          <w:rFonts w:eastAsiaTheme="majorEastAsia"/>
+          <w:sz w:val="22"/>
+          <w:szCs w:val="22"/>
+        </w:rPr>
+        <w:t>Protocole expérimental</w:t>
+      </w:r>
+    </w:p>
+    <w:p>
+      <w:pPr>
+        <w:pStyle w:val="paragraph"/>
+        <w:numPr>
+          <w:ilvl w:val="2"/>
+          <w:numId w:val="13"/>
+        </w:numPr>
+        <w:spacing w:before="0" w:beforeAutospacing="0" w:after="0" w:afterAutospacing="0"/>
+        <w:textAlignment w:val="baseline"/>
+        <w:rPr>
+          <w:rStyle w:val="eop"/>
+          <w:sz w:val="22"/>
+          <w:szCs w:val="22"/>
+        </w:rPr>
+      </w:pPr>
+      <w:r>
+        <w:rPr>
+          <w:rStyle w:val="eop"/>
+          <w:rFonts w:eastAsiaTheme="majorEastAsia"/>
+          <w:sz w:val="22"/>
+          <w:szCs w:val="22"/>
+        </w:rPr>
+        <w:t>Recrutement</w:t>
+      </w:r>
+    </w:p>
+    <w:p>
+      <w:pPr>
+        <w:pStyle w:val="paragraph"/>
+        <w:numPr>
+          <w:ilvl w:val="2"/>
+          <w:numId w:val="13"/>
+        </w:numPr>
+        <w:spacing w:before="0" w:beforeAutospacing="0" w:after="0" w:afterAutospacing="0"/>
+        <w:textAlignment w:val="baseline"/>
+        <w:rPr>
+          <w:rStyle w:val="eop"/>
+          <w:sz w:val="22"/>
+          <w:szCs w:val="22"/>
+        </w:rPr>
+      </w:pPr>
+      <w:r>
+        <w:rPr>
+          <w:rStyle w:val="eop"/>
+          <w:rFonts w:eastAsiaTheme="majorEastAsia"/>
+          <w:sz w:val="22"/>
+          <w:szCs w:val="22"/>
+        </w:rPr>
+        <w:t>Expériences, hypothèses et objectifs</w:t>
+      </w:r>
+    </w:p>
+    <w:p>
+      <w:pPr>
+        <w:pStyle w:val="paragraph"/>
+        <w:numPr>
+          <w:ilvl w:val="2"/>
+          <w:numId w:val="13"/>
+        </w:numPr>
+        <w:spacing w:before="0" w:beforeAutospacing="0" w:after="0" w:afterAutospacing="0"/>
+        <w:textAlignment w:val="baseline"/>
+        <w:rPr>
+          <w:sz w:val="22"/>
+          <w:szCs w:val="22"/>
+        </w:rPr>
+      </w:pPr>
+      <w:r>
+        <w:rPr>
+          <w:rStyle w:val="eop"/>
+          <w:rFonts w:eastAsiaTheme="majorEastAsia"/>
+          <w:sz w:val="22"/>
+          <w:szCs w:val="22"/>
+        </w:rPr>
+        <w:t>Déroulement expérimental</w:t>
       </w:r>
     </w:p>
     <w:p>
@@ -3358,7 +3550,7 @@
 </file>
 
 <file path=word/comments.xml><?xml version="1.0" encoding="utf-8"?>
-<w:comments xmlns:wpc="http://schemas.microsoft.com/office/word/2010/wordprocessingCanvas" xmlns:cx="http://schemas.microsoft.com/office/drawing/2014/chartex" xmlns:cx1="http://schemas.microsoft.com/office/drawing/2015/9/8/chartex" xmlns:mc="http://schemas.openxmlformats.org/markup-compatibility/2006" xmlns:o="urn:schemas-microsoft-com:office:office" xmlns:r="http://schemas.openxmlformats.org/officeDocument/2006/relationships" xmlns:m="http://schemas.openxmlformats.org/officeDocument/2006/math" xmlns:v="urn:schemas-microsoft-com:vml" xmlns:wp14="http://schemas.microsoft.com/office/word/2010/wordprocessingDrawing" xmlns:wp="http://schemas.openxmlformats.org/drawingml/2006/wordprocessingDrawing" xmlns:w10="urn:schemas-microsoft-com:office:word" xmlns:w="http://schemas.openxmlformats.org/wordprocessingml/2006/main" xmlns:w14="http://schemas.microsoft.com/office/word/2010/wordml" xmlns:w15="http://schemas.microsoft.com/office/word/2012/wordml" xmlns:w16se="http://schemas.microsoft.com/office/word/2015/wordml/symex" xmlns:wpg="http://schemas.microsoft.com/office/word/2010/wordprocessingGroup" xmlns:wpi="http://schemas.microsoft.com/office/word/2010/wordprocessingInk" xmlns:wne="http://schemas.microsoft.com/office/word/2006/wordml" xmlns:wps="http://schemas.microsoft.com/office/word/2010/wordprocessingShape" mc:Ignorable="w14 w15 w16se wp14">
+<w:comments xmlns:wpc="http://schemas.microsoft.com/office/word/2010/wordprocessingCanvas" xmlns:cx="http://schemas.microsoft.com/office/drawing/2014/chartex" xmlns:cx1="http://schemas.microsoft.com/office/drawing/2015/9/8/chartex" xmlns:cx2="http://schemas.microsoft.com/office/drawing/2015/10/21/chartex" xmlns:cx3="http://schemas.microsoft.com/office/drawing/2016/5/9/chartex" xmlns:cx4="http://schemas.microsoft.com/office/drawing/2016/5/10/chartex" xmlns:cx5="http://schemas.microsoft.com/office/drawing/2016/5/11/chartex" xmlns:cx6="http://schemas.microsoft.com/office/drawing/2016/5/12/chartex" xmlns:cx7="http://schemas.microsoft.com/office/drawing/2016/5/13/chartex" xmlns:cx8="http://schemas.microsoft.com/office/drawing/2016/5/14/chartex" xmlns:mc="http://schemas.openxmlformats.org/markup-compatibility/2006" xmlns:aink="http://schemas.microsoft.com/office/drawing/2016/ink" xmlns:am3d="http://schemas.microsoft.com/office/drawing/2017/model3d" xmlns:o="urn:schemas-microsoft-com:office:office" xmlns:r="http://schemas.openxmlformats.org/officeDocument/2006/relationships" xmlns:m="http://schemas.openxmlformats.org/officeDocument/2006/math" xmlns:v="urn:schemas-microsoft-com:vml" xmlns:wp14="http://schemas.microsoft.com/office/word/2010/wordprocessingDrawing" xmlns:wp="http://schemas.openxmlformats.org/drawingml/2006/wordprocessingDrawing" xmlns:w10="urn:schemas-microsoft-com:office:word" xmlns:w="http://schemas.openxmlformats.org/wordprocessingml/2006/main" xmlns:w14="http://schemas.microsoft.com/office/word/2010/wordml" xmlns:w15="http://schemas.microsoft.com/office/word/2012/wordml" xmlns:w16cex="http://schemas.microsoft.com/office/word/2018/wordml/cex" xmlns:w16cid="http://schemas.microsoft.com/office/word/2016/wordml/cid" xmlns:w16="http://schemas.microsoft.com/office/word/2018/wordml" xmlns:w16se="http://schemas.microsoft.com/office/word/2015/wordml/symex" xmlns:wpg="http://schemas.microsoft.com/office/word/2010/wordprocessingGroup" xmlns:wpi="http://schemas.microsoft.com/office/word/2010/wordprocessingInk" xmlns:wne="http://schemas.microsoft.com/office/word/2006/wordml" xmlns:wps="http://schemas.microsoft.com/office/word/2010/wordprocessingShape" mc:Ignorable="w14 w15 w16se w16cid w16 w16cex wp14">
   <w:comment w:id="0" w:author="Auto" w:date="2021-06-25T15:31:00Z" w:initials="Auto">
     <w:p>
       <w:pPr>
@@ -3424,7 +3616,7 @@
 </file>
 
 <file path=word/commentsExtended.xml><?xml version="1.0" encoding="utf-8"?>
-<w15:commentsEx xmlns:wpc="http://schemas.microsoft.com/office/word/2010/wordprocessingCanvas" xmlns:cx="http://schemas.microsoft.com/office/drawing/2014/chartex" xmlns:cx1="http://schemas.microsoft.com/office/drawing/2015/9/8/chartex" xmlns:mc="http://schemas.openxmlformats.org/markup-compatibility/2006" xmlns:o="urn:schemas-microsoft-com:office:office" xmlns:r="http://schemas.openxmlformats.org/officeDocument/2006/relationships" xmlns:m="http://schemas.openxmlformats.org/officeDocument/2006/math" xmlns:v="urn:schemas-microsoft-com:vml" xmlns:wp14="http://schemas.microsoft.com/office/word/2010/wordprocessingDrawing" xmlns:wp="http://schemas.openxmlformats.org/drawingml/2006/wordprocessingDrawing" xmlns:w10="urn:schemas-microsoft-com:office:word" xmlns:w="http://schemas.openxmlformats.org/wordprocessingml/2006/main" xmlns:w14="http://schemas.microsoft.com/office/word/2010/wordml" xmlns:w15="http://schemas.microsoft.com/office/word/2012/wordml" xmlns:w16se="http://schemas.microsoft.com/office/word/2015/wordml/symex" xmlns:wpg="http://schemas.microsoft.com/office/word/2010/wordprocessingGroup" xmlns:wpi="http://schemas.microsoft.com/office/word/2010/wordprocessingInk" xmlns:wne="http://schemas.microsoft.com/office/word/2006/wordml" xmlns:wps="http://schemas.microsoft.com/office/word/2010/wordprocessingShape" mc:Ignorable="w14 w15 w16se wp14">
+<w15:commentsEx xmlns:wpc="http://schemas.microsoft.com/office/word/2010/wordprocessingCanvas" xmlns:cx="http://schemas.microsoft.com/office/drawing/2014/chartex" xmlns:cx1="http://schemas.microsoft.com/office/drawing/2015/9/8/chartex" xmlns:cx2="http://schemas.microsoft.com/office/drawing/2015/10/21/chartex" xmlns:cx3="http://schemas.microsoft.com/office/drawing/2016/5/9/chartex" xmlns:cx4="http://schemas.microsoft.com/office/drawing/2016/5/10/chartex" xmlns:cx5="http://schemas.microsoft.com/office/drawing/2016/5/11/chartex" xmlns:cx6="http://schemas.microsoft.com/office/drawing/2016/5/12/chartex" xmlns:cx7="http://schemas.microsoft.com/office/drawing/2016/5/13/chartex" xmlns:cx8="http://schemas.microsoft.com/office/drawing/2016/5/14/chartex" xmlns:mc="http://schemas.openxmlformats.org/markup-compatibility/2006" xmlns:aink="http://schemas.microsoft.com/office/drawing/2016/ink" xmlns:am3d="http://schemas.microsoft.com/office/drawing/2017/model3d" xmlns:o="urn:schemas-microsoft-com:office:office" xmlns:r="http://schemas.openxmlformats.org/officeDocument/2006/relationships" xmlns:m="http://schemas.openxmlformats.org/officeDocument/2006/math" xmlns:v="urn:schemas-microsoft-com:vml" xmlns:wp14="http://schemas.microsoft.com/office/word/2010/wordprocessingDrawing" xmlns:wp="http://schemas.openxmlformats.org/drawingml/2006/wordprocessingDrawing" xmlns:w10="urn:schemas-microsoft-com:office:word" xmlns:w="http://schemas.openxmlformats.org/wordprocessingml/2006/main" xmlns:w14="http://schemas.microsoft.com/office/word/2010/wordml" xmlns:w15="http://schemas.microsoft.com/office/word/2012/wordml" xmlns:w16cex="http://schemas.microsoft.com/office/word/2018/wordml/cex" xmlns:w16cid="http://schemas.microsoft.com/office/word/2016/wordml/cid" xmlns:w16="http://schemas.microsoft.com/office/word/2018/wordml" xmlns:w16se="http://schemas.microsoft.com/office/word/2015/wordml/symex" xmlns:wpg="http://schemas.microsoft.com/office/word/2010/wordprocessingGroup" xmlns:wpi="http://schemas.microsoft.com/office/word/2010/wordprocessingInk" xmlns:wne="http://schemas.microsoft.com/office/word/2006/wordml" xmlns:wps="http://schemas.microsoft.com/office/word/2010/wordprocessingShape" mc:Ignorable="w14 w15 w16se w16cid w16 w16cex wp14">
   <w15:commentEx w15:paraId="51939B5B" w15:done="0"/>
   <w15:commentEx w15:paraId="26BBC502" w15:done="0"/>
   <w15:commentEx w15:paraId="0C819421" w15:done="0"/>
@@ -3432,8 +3624,17 @@
 </w15:commentsEx>
 </file>
 
+<file path=word/commentsIds.xml><?xml version="1.0" encoding="utf-8"?>
+<w16cid:commentsIds xmlns:wpc="http://schemas.microsoft.com/office/word/2010/wordprocessingCanvas" xmlns:cx="http://schemas.microsoft.com/office/drawing/2014/chartex" xmlns:cx1="http://schemas.microsoft.com/office/drawing/2015/9/8/chartex" xmlns:cx2="http://schemas.microsoft.com/office/drawing/2015/10/21/chartex" xmlns:cx3="http://schemas.microsoft.com/office/drawing/2016/5/9/chartex" xmlns:cx4="http://schemas.microsoft.com/office/drawing/2016/5/10/chartex" xmlns:cx5="http://schemas.microsoft.com/office/drawing/2016/5/11/chartex" xmlns:cx6="http://schemas.microsoft.com/office/drawing/2016/5/12/chartex" xmlns:cx7="http://schemas.microsoft.com/office/drawing/2016/5/13/chartex" xmlns:cx8="http://schemas.microsoft.com/office/drawing/2016/5/14/chartex" xmlns:mc="http://schemas.openxmlformats.org/markup-compatibility/2006" xmlns:aink="http://schemas.microsoft.com/office/drawing/2016/ink" xmlns:am3d="http://schemas.microsoft.com/office/drawing/2017/model3d" xmlns:o="urn:schemas-microsoft-com:office:office" xmlns:r="http://schemas.openxmlformats.org/officeDocument/2006/relationships" xmlns:m="http://schemas.openxmlformats.org/officeDocument/2006/math" xmlns:v="urn:schemas-microsoft-com:vml" xmlns:wp14="http://schemas.microsoft.com/office/word/2010/wordprocessingDrawing" xmlns:wp="http://schemas.openxmlformats.org/drawingml/2006/wordprocessingDrawing" xmlns:w10="urn:schemas-microsoft-com:office:word" xmlns:w="http://schemas.openxmlformats.org/wordprocessingml/2006/main" xmlns:w14="http://schemas.microsoft.com/office/word/2010/wordml" xmlns:w15="http://schemas.microsoft.com/office/word/2012/wordml" xmlns:w16cex="http://schemas.microsoft.com/office/word/2018/wordml/cex" xmlns:w16cid="http://schemas.microsoft.com/office/word/2016/wordml/cid" xmlns:w16="http://schemas.microsoft.com/office/word/2018/wordml" xmlns:w16se="http://schemas.microsoft.com/office/word/2015/wordml/symex" xmlns:wpg="http://schemas.microsoft.com/office/word/2010/wordprocessingGroup" xmlns:wpi="http://schemas.microsoft.com/office/word/2010/wordprocessingInk" xmlns:wne="http://schemas.microsoft.com/office/word/2006/wordml" xmlns:wps="http://schemas.microsoft.com/office/word/2010/wordprocessingShape" mc:Ignorable="w14 w15 w16se w16cid w16 w16cex wp14">
+  <w16cid:commentId w16cid:paraId="51939B5B" w16cid:durableId="2533739A"/>
+  <w16cid:commentId w16cid:paraId="26BBC502" w16cid:durableId="2533739B"/>
+  <w16cid:commentId w16cid:paraId="0C819421" w16cid:durableId="2533739C"/>
+  <w16cid:commentId w16cid:paraId="621C6484" w16cid:durableId="2533739D"/>
+</w16cid:commentsIds>
+</file>
+
 <file path=word/numbering.xml><?xml version="1.0" encoding="utf-8"?>
-<w:numbering xmlns:wpc="http://schemas.microsoft.com/office/word/2010/wordprocessingCanvas" xmlns:cx="http://schemas.microsoft.com/office/drawing/2014/chartex" xmlns:cx1="http://schemas.microsoft.com/office/drawing/2015/9/8/chartex" xmlns:mc="http://schemas.openxmlformats.org/markup-compatibility/2006" xmlns:o="urn:schemas-microsoft-com:office:office" xmlns:r="http://schemas.openxmlformats.org/officeDocument/2006/relationships" xmlns:m="http://schemas.openxmlformats.org/officeDocument/2006/math" xmlns:v="urn:schemas-microsoft-com:vml" xmlns:wp14="http://schemas.microsoft.com/office/word/2010/wordprocessingDrawing" xmlns:wp="http://schemas.openxmlformats.org/drawingml/2006/wordprocessingDrawing" xmlns:w10="urn:schemas-microsoft-com:office:word" xmlns:w="http://schemas.openxmlformats.org/wordprocessingml/2006/main" xmlns:w14="http://schemas.microsoft.com/office/word/2010/wordml" xmlns:w15="http://schemas.microsoft.com/office/word/2012/wordml" xmlns:w16se="http://schemas.microsoft.com/office/word/2015/wordml/symex" xmlns:wpg="http://schemas.microsoft.com/office/word/2010/wordprocessingGroup" xmlns:wpi="http://schemas.microsoft.com/office/word/2010/wordprocessingInk" xmlns:wne="http://schemas.microsoft.com/office/word/2006/wordml" xmlns:wps="http://schemas.microsoft.com/office/word/2010/wordprocessingShape" mc:Ignorable="w14 w15 w16se wp14">
+<w:numbering xmlns:wpc="http://schemas.microsoft.com/office/word/2010/wordprocessingCanvas" xmlns:cx="http://schemas.microsoft.com/office/drawing/2014/chartex" xmlns:cx1="http://schemas.microsoft.com/office/drawing/2015/9/8/chartex" xmlns:cx2="http://schemas.microsoft.com/office/drawing/2015/10/21/chartex" xmlns:cx3="http://schemas.microsoft.com/office/drawing/2016/5/9/chartex" xmlns:cx4="http://schemas.microsoft.com/office/drawing/2016/5/10/chartex" xmlns:cx5="http://schemas.microsoft.com/office/drawing/2016/5/11/chartex" xmlns:cx6="http://schemas.microsoft.com/office/drawing/2016/5/12/chartex" xmlns:cx7="http://schemas.microsoft.com/office/drawing/2016/5/13/chartex" xmlns:cx8="http://schemas.microsoft.com/office/drawing/2016/5/14/chartex" xmlns:mc="http://schemas.openxmlformats.org/markup-compatibility/2006" xmlns:aink="http://schemas.microsoft.com/office/drawing/2016/ink" xmlns:am3d="http://schemas.microsoft.com/office/drawing/2017/model3d" xmlns:o="urn:schemas-microsoft-com:office:office" xmlns:r="http://schemas.openxmlformats.org/officeDocument/2006/relationships" xmlns:m="http://schemas.openxmlformats.org/officeDocument/2006/math" xmlns:v="urn:schemas-microsoft-com:vml" xmlns:wp14="http://schemas.microsoft.com/office/word/2010/wordprocessingDrawing" xmlns:wp="http://schemas.openxmlformats.org/drawingml/2006/wordprocessingDrawing" xmlns:w10="urn:schemas-microsoft-com:office:word" xmlns:w="http://schemas.openxmlformats.org/wordprocessingml/2006/main" xmlns:w14="http://schemas.microsoft.com/office/word/2010/wordml" xmlns:w15="http://schemas.microsoft.com/office/word/2012/wordml" xmlns:w16cex="http://schemas.microsoft.com/office/word/2018/wordml/cex" xmlns:w16cid="http://schemas.microsoft.com/office/word/2016/wordml/cid" xmlns:w16="http://schemas.microsoft.com/office/word/2018/wordml" xmlns:w16se="http://schemas.microsoft.com/office/word/2015/wordml/symex" xmlns:wpg="http://schemas.microsoft.com/office/word/2010/wordprocessingGroup" xmlns:wpi="http://schemas.microsoft.com/office/word/2010/wordprocessingInk" xmlns:wne="http://schemas.microsoft.com/office/word/2006/wordml" xmlns:wps="http://schemas.microsoft.com/office/word/2010/wordprocessingShape" mc:Ignorable="w14 w15 w16se w16cid w16 w16cex wp14">
   <w:abstractNum w:abstractNumId="0" w15:restartNumberingAfterBreak="0">
     <w:nsid w:val="072B2234"/>
     <w:multiLevelType w:val="multilevel"/>
@@ -4874,7 +5075,7 @@
         <w:ind w:left="720" w:hanging="360"/>
       </w:pPr>
     </w:lvl>
-    <w:lvl w:ilvl="1" w:tentative="1">
+    <w:lvl w:ilvl="1">
       <w:start w:val="1"/>
       <w:numFmt w:val="lowerLetter"/>
       <w:lvlText w:val="%2."/>
@@ -4886,7 +5087,7 @@
         <w:ind w:left="1440" w:hanging="360"/>
       </w:pPr>
     </w:lvl>
-    <w:lvl w:ilvl="2" w:tentative="1">
+    <w:lvl w:ilvl="2">
       <w:start w:val="1"/>
       <w:numFmt w:val="lowerLetter"/>
       <w:lvlText w:val="%3."/>
@@ -4898,7 +5099,7 @@
         <w:ind w:left="2160" w:hanging="360"/>
       </w:pPr>
     </w:lvl>
-    <w:lvl w:ilvl="3" w:tentative="1">
+    <w:lvl w:ilvl="3">
       <w:start w:val="1"/>
       <w:numFmt w:val="lowerLetter"/>
       <w:lvlText w:val="%4."/>
@@ -6533,7 +6734,7 @@
 </file>
 
 <file path=word/people.xml><?xml version="1.0" encoding="utf-8"?>
-<w15:people xmlns:wpc="http://schemas.microsoft.com/office/word/2010/wordprocessingCanvas" xmlns:cx="http://schemas.microsoft.com/office/drawing/2014/chartex" xmlns:cx1="http://schemas.microsoft.com/office/drawing/2015/9/8/chartex" xmlns:mc="http://schemas.openxmlformats.org/markup-compatibility/2006" xmlns:o="urn:schemas-microsoft-com:office:office" xmlns:r="http://schemas.openxmlformats.org/officeDocument/2006/relationships" xmlns:m="http://schemas.openxmlformats.org/officeDocument/2006/math" xmlns:v="urn:schemas-microsoft-com:vml" xmlns:wp14="http://schemas.microsoft.com/office/word/2010/wordprocessingDrawing" xmlns:wp="http://schemas.openxmlformats.org/drawingml/2006/wordprocessingDrawing" xmlns:w10="urn:schemas-microsoft-com:office:word" xmlns:w="http://schemas.openxmlformats.org/wordprocessingml/2006/main" xmlns:w14="http://schemas.microsoft.com/office/word/2010/wordml" xmlns:w15="http://schemas.microsoft.com/office/word/2012/wordml" xmlns:w16se="http://schemas.microsoft.com/office/word/2015/wordml/symex" xmlns:wpg="http://schemas.microsoft.com/office/word/2010/wordprocessingGroup" xmlns:wpi="http://schemas.microsoft.com/office/word/2010/wordprocessingInk" xmlns:wne="http://schemas.microsoft.com/office/word/2006/wordml" xmlns:wps="http://schemas.microsoft.com/office/word/2010/wordprocessingShape" mc:Ignorable="w14 w15 w16se wp14">
+<w15:people xmlns:wpc="http://schemas.microsoft.com/office/word/2010/wordprocessingCanvas" xmlns:cx="http://schemas.microsoft.com/office/drawing/2014/chartex" xmlns:cx1="http://schemas.microsoft.com/office/drawing/2015/9/8/chartex" xmlns:cx2="http://schemas.microsoft.com/office/drawing/2015/10/21/chartex" xmlns:cx3="http://schemas.microsoft.com/office/drawing/2016/5/9/chartex" xmlns:cx4="http://schemas.microsoft.com/office/drawing/2016/5/10/chartex" xmlns:cx5="http://schemas.microsoft.com/office/drawing/2016/5/11/chartex" xmlns:cx6="http://schemas.microsoft.com/office/drawing/2016/5/12/chartex" xmlns:cx7="http://schemas.microsoft.com/office/drawing/2016/5/13/chartex" xmlns:cx8="http://schemas.microsoft.com/office/drawing/2016/5/14/chartex" xmlns:mc="http://schemas.openxmlformats.org/markup-compatibility/2006" xmlns:aink="http://schemas.microsoft.com/office/drawing/2016/ink" xmlns:am3d="http://schemas.microsoft.com/office/drawing/2017/model3d" xmlns:o="urn:schemas-microsoft-com:office:office" xmlns:r="http://schemas.openxmlformats.org/officeDocument/2006/relationships" xmlns:m="http://schemas.openxmlformats.org/officeDocument/2006/math" xmlns:v="urn:schemas-microsoft-com:vml" xmlns:wp14="http://schemas.microsoft.com/office/word/2010/wordprocessingDrawing" xmlns:wp="http://schemas.openxmlformats.org/drawingml/2006/wordprocessingDrawing" xmlns:w10="urn:schemas-microsoft-com:office:word" xmlns:w="http://schemas.openxmlformats.org/wordprocessingml/2006/main" xmlns:w14="http://schemas.microsoft.com/office/word/2010/wordml" xmlns:w15="http://schemas.microsoft.com/office/word/2012/wordml" xmlns:w16cex="http://schemas.microsoft.com/office/word/2018/wordml/cex" xmlns:w16cid="http://schemas.microsoft.com/office/word/2016/wordml/cid" xmlns:w16="http://schemas.microsoft.com/office/word/2018/wordml" xmlns:w16se="http://schemas.microsoft.com/office/word/2015/wordml/symex" xmlns:wpg="http://schemas.microsoft.com/office/word/2010/wordprocessingGroup" xmlns:wpi="http://schemas.microsoft.com/office/word/2010/wordprocessingInk" xmlns:wne="http://schemas.microsoft.com/office/word/2006/wordml" xmlns:wps="http://schemas.microsoft.com/office/word/2010/wordprocessingShape" mc:Ignorable="w14 w15 w16se w16cid w16 w16cex wp14">
   <w15:person w15:author="Auto">
     <w15:presenceInfo w15:providerId="None" w15:userId="Auto"/>
   </w15:person>
@@ -6541,7 +6742,7 @@
 </file>
 
 <file path=word/styles.xml><?xml version="1.0" encoding="utf-8"?>
-<w:styles xmlns:mc="http://schemas.openxmlformats.org/markup-compatibility/2006" xmlns:r="http://schemas.openxmlformats.org/officeDocument/2006/relationships" xmlns:w="http://schemas.openxmlformats.org/wordprocessingml/2006/main" xmlns:w14="http://schemas.microsoft.com/office/word/2010/wordml" xmlns:w15="http://schemas.microsoft.com/office/word/2012/wordml" xmlns:w16se="http://schemas.microsoft.com/office/word/2015/wordml/symex" mc:Ignorable="w14 w15 w16se">
+<w:styles xmlns:mc="http://schemas.openxmlformats.org/markup-compatibility/2006" xmlns:r="http://schemas.openxmlformats.org/officeDocument/2006/relationships" xmlns:w="http://schemas.openxmlformats.org/wordprocessingml/2006/main" xmlns:w14="http://schemas.microsoft.com/office/word/2010/wordml" xmlns:w15="http://schemas.microsoft.com/office/word/2012/wordml" xmlns:w16cex="http://schemas.microsoft.com/office/word/2018/wordml/cex" xmlns:w16cid="http://schemas.microsoft.com/office/word/2016/wordml/cid" xmlns:w16="http://schemas.microsoft.com/office/word/2018/wordml" xmlns:w16se="http://schemas.microsoft.com/office/word/2015/wordml/symex" mc:Ignorable="w14 w15 w16se w16cid w16 w16cex">
   <w:docDefaults>
     <w:rPrDefault>
       <w:rPr>
@@ -6557,7 +6758,7 @@
       </w:pPr>
     </w:pPrDefault>
   </w:docDefaults>
-  <w:latentStyles w:defLockedState="0" w:defUIPriority="99" w:defSemiHidden="0" w:defUnhideWhenUsed="0" w:defQFormat="0" w:count="371">
+  <w:latentStyles w:defLockedState="0" w:defUIPriority="99" w:defSemiHidden="0" w:defUnhideWhenUsed="0" w:defQFormat="0" w:count="376">
     <w:lsdException w:name="Normal" w:uiPriority="0" w:qFormat="1"/>
     <w:lsdException w:name="heading 1" w:uiPriority="9" w:qFormat="1"/>
     <w:lsdException w:name="heading 2" w:semiHidden="1" w:uiPriority="9" w:unhideWhenUsed="1" w:qFormat="1"/>
@@ -6663,7 +6864,6 @@
     <w:lsdException w:name="HTML Sample" w:semiHidden="1" w:unhideWhenUsed="1"/>
     <w:lsdException w:name="HTML Typewriter" w:semiHidden="1" w:unhideWhenUsed="1"/>
     <w:lsdException w:name="HTML Variable" w:semiHidden="1" w:unhideWhenUsed="1"/>
-    <w:lsdException w:name="Normal Table" w:semiHidden="1" w:unhideWhenUsed="1"/>
     <w:lsdException w:name="annotation subject" w:semiHidden="1" w:unhideWhenUsed="1"/>
     <w:lsdException w:name="No List" w:semiHidden="1" w:unhideWhenUsed="1"/>
     <w:lsdException w:name="Outline List 1" w:semiHidden="1" w:unhideWhenUsed="1"/>
@@ -6706,11 +6906,8 @@
     <w:lsdException w:name="Table Contemporary" w:semiHidden="1" w:unhideWhenUsed="1"/>
     <w:lsdException w:name="Table Elegant" w:semiHidden="1" w:unhideWhenUsed="1"/>
     <w:lsdException w:name="Table Professional" w:semiHidden="1" w:unhideWhenUsed="1"/>
-    <w:lsdException w:name="Table Subtle 1" w:semiHidden="1" w:unhideWhenUsed="1"/>
     <w:lsdException w:name="Table Subtle 2" w:semiHidden="1" w:unhideWhenUsed="1"/>
     <w:lsdException w:name="Table Web 1" w:semiHidden="1" w:unhideWhenUsed="1"/>
-    <w:lsdException w:name="Table Web 2" w:semiHidden="1" w:unhideWhenUsed="1"/>
-    <w:lsdException w:name="Table Web 3" w:semiHidden="1" w:unhideWhenUsed="1"/>
     <w:lsdException w:name="Balloon Text" w:semiHidden="1" w:unhideWhenUsed="1"/>
     <w:lsdException w:name="Table Grid" w:uiPriority="39"/>
     <w:lsdException w:name="Table Theme" w:semiHidden="1" w:unhideWhenUsed="1"/>
@@ -6929,6 +7126,11 @@
     <w:lsdException w:name="List Table 5 Dark Accent 6" w:uiPriority="50"/>
     <w:lsdException w:name="List Table 6 Colorful Accent 6" w:uiPriority="51"/>
     <w:lsdException w:name="List Table 7 Colorful Accent 6" w:uiPriority="52"/>
+    <w:lsdException w:name="Mention" w:semiHidden="1" w:unhideWhenUsed="1"/>
+    <w:lsdException w:name="Smart Hyperlink" w:semiHidden="1" w:unhideWhenUsed="1"/>
+    <w:lsdException w:name="Hashtag" w:semiHidden="1" w:unhideWhenUsed="1"/>
+    <w:lsdException w:name="Unresolved Mention" w:semiHidden="1" w:unhideWhenUsed="1"/>
+    <w:lsdException w:name="Smart Link" w:semiHidden="1" w:unhideWhenUsed="1"/>
   </w:latentStyles>
   <w:style w:type="paragraph" w:default="1" w:styleId="Normal">
     <w:name w:val="Normal"/>

</xml_diff>